<commit_message>
feat(ebbw): additional dms placeholders for linked dossiers and additional demand
</commit_message>
<xml_diff>
--- a/document-merge-service/kt_gr/templatefiles/archiv_ebbw_de.docx
+++ b/document-merge-service/kt_gr/templatefiles/archiv_ebbw_de.docx
@@ -345,7 +345,32 @@
           <w:sz w:val="36"/>
           <w:szCs w:val="36"/>
         </w:rPr>
-        <w:t xml:space="preserve">{{ caseType }}</w:t>
+        <w:t xml:space="preserve">{{ </w:t>
+      </w:r>
+      <w:r>
+        <w:rPr>
+          <w:rFonts w:ascii="Carlito" w:hAnsi="Carlito" w:eastAsia="NSimSun" w:cs="Calibri Light"/>
+          <w:sz w:val="36"/>
+          <w:szCs w:val="36"/>
+        </w:rPr>
+        <w:t xml:space="preserve">FORM_NAME</w:t>
+      </w:r>
+      <w:r>
+        <w:rPr>
+          <w:rFonts w:ascii="Carlito" w:hAnsi="Carlito" w:eastAsia="NSimSun" w:cs="Calibri Light"/>
+          <w:sz w:val="36"/>
+          <w:szCs w:val="36"/>
+          <w:lang w:val="en-US"/>
+        </w:rPr>
+        <w:t xml:space="preserve"> </w:t>
+      </w:r>
+      <w:r>
+        <w:rPr>
+          <w:rFonts w:ascii="Carlito" w:hAnsi="Carlito" w:eastAsia="NSimSun" w:cs="Calibri Light"/>
+          <w:sz w:val="36"/>
+          <w:szCs w:val="36"/>
+        </w:rPr>
+        <w:t xml:space="preserve">}}</w:t>
       </w:r>
       <w:r>
         <w:rPr>
@@ -376,29 +401,58 @@
           <w:sz w:val="36"/>
           <w:szCs w:val="36"/>
         </w:rPr>
-        <w:t xml:space="preserve">Dossier-Nr. {{ dossierNr }} / ID {{ caseId }}</w:t>
+        <w:t xml:space="preserve">Dossier-Nr. {{ </w:t>
       </w:r>
       <w:r>
         <w:rPr>
-          <w:rFonts w:ascii="Carlito" w:hAnsi="Carlito"/>
+          <w:rFonts w:ascii="Carlito" w:hAnsi="Carlito" w:eastAsia="NSimSun" w:cs="Calibri Light"/>
+          <w:sz w:val="36"/>
+          <w:szCs w:val="36"/>
         </w:rPr>
+        <w:t xml:space="preserve">DOSSIER_NUMBER</w:t>
       </w:r>
       <w:r>
         <w:rPr>
-          <w:rFonts w:ascii="Carlito" w:hAnsi="Carlito"/>
+          <w:rFonts w:ascii="Carlito" w:hAnsi="Carlito" w:eastAsia="NSimSun" w:cs="Calibri Light"/>
+          <w:sz w:val="36"/>
+          <w:szCs w:val="36"/>
+          <w:lang w:val="en-US"/>
         </w:rPr>
+        <w:t xml:space="preserve"> </w:t>
       </w:r>
       <w:r>
         <w:rPr>
-          <w:rFonts w:ascii="Carlito" w:hAnsi="Carlito"/>
-          <w:highlight w:val="none"/>
+          <w:rFonts w:ascii="Carlito" w:hAnsi="Carlito" w:eastAsia="NSimSun" w:cs="Calibri Light"/>
+          <w:sz w:val="36"/>
+          <w:szCs w:val="36"/>
         </w:rPr>
+        <w:t xml:space="preserve">}} / ID {{ </w:t>
       </w:r>
       <w:r>
         <w:rPr>
-          <w:rFonts w:ascii="Carlito" w:hAnsi="Carlito"/>
-          <w:highlight w:val="none"/>
+          <w:rFonts w:ascii="Carlito" w:hAnsi="Carlito" w:eastAsia="NSimSun" w:cs="Calibri Light"/>
+          <w:sz w:val="36"/>
+          <w:szCs w:val="36"/>
+          <w:lang w:val="en-US"/>
         </w:rPr>
+        <w:t xml:space="preserve">ID</w:t>
+      </w:r>
+      <w:r>
+        <w:rPr>
+          <w:rFonts w:ascii="Carlito" w:hAnsi="Carlito" w:eastAsia="NSimSun" w:cs="Calibri Light"/>
+          <w:sz w:val="36"/>
+          <w:szCs w:val="36"/>
+          <w:lang w:val="en-US"/>
+        </w:rPr>
+        <w:t xml:space="preserve"> </w:t>
+      </w:r>
+      <w:r>
+        <w:rPr>
+          <w:rFonts w:ascii="Carlito" w:hAnsi="Carlito" w:eastAsia="NSimSun" w:cs="Calibri Light"/>
+          <w:sz w:val="36"/>
+          <w:szCs w:val="36"/>
+        </w:rPr>
+        <w:t xml:space="preserve">}}</w:t>
       </w:r>
       <w:r>
         <w:rPr>
@@ -438,13 +492,8 @@
       </w:r>
       <w:r>
         <w:rPr>
-          <w:rFonts w:ascii="Carlito" w:cs="Carlito"/>
-          <w:b/>
-          <w:bCs/>
-          <w:sz w:val="38"/>
-          <w:szCs w:val="38"/>
+          <w:rFonts w:ascii="Carlito" w:hAnsi="Carlito"/>
           <w:highlight w:val="none"/>
-          <w:lang w:val="en-US"/>
         </w:rPr>
       </w:r>
       <w:r>
@@ -535,7 +584,13 @@
       </w:r>
       <w:r>
         <w:rPr>
-          <w:rFonts w:ascii="Carlito" w:hAnsi="Carlito"/>
+          <w:rFonts w:ascii="Carlito" w:cs="Carlito"/>
+          <w:b/>
+          <w:bCs/>
+          <w:sz w:val="38"/>
+          <w:szCs w:val="38"/>
+          <w:highlight w:val="none"/>
+          <w:lang w:val="en-US"/>
         </w:rPr>
       </w:r>
       <w:r>
@@ -570,7 +625,6 @@
       <w:r>
         <w:rPr>
           <w:rFonts w:ascii="Carlito" w:hAnsi="Carlito"/>
-          <w:highlight w:val="none"/>
         </w:rPr>
       </w:r>
       <w:r>
@@ -598,6 +652,12 @@
       <w:r>
         <w:rPr>
           <w:rFonts w:ascii="Carlito" w:hAnsi="Carlito" w:eastAsia="Carlito" w:cs="Carlito"/>
+          <w:highlight w:val="none"/>
+        </w:rPr>
+      </w:r>
+      <w:r>
+        <w:rPr>
+          <w:rFonts w:ascii="Carlito" w:hAnsi="Carlito" w:cs="Carlito"/>
           <w:highlight w:val="none"/>
         </w:rPr>
       </w:r>
@@ -636,6 +696,13 @@
           <w:szCs w:val="32"/>
         </w:rPr>
       </w:r>
+      <w:r>
+        <w:rPr>
+          <w:rFonts w:ascii="Carlito" w:hAnsi="Carlito" w:cs="Carlito"/>
+          <w:sz w:val="32"/>
+          <w:szCs w:val="32"/>
+        </w:rPr>
+      </w:r>
     </w:p>
     <w:p>
       <w:pPr>
@@ -665,6 +732,11 @@
           <w:rFonts w:ascii="Carlito" w:hAnsi="Carlito" w:eastAsia="Carlito" w:cs="Carlito"/>
         </w:rPr>
       </w:r>
+      <w:r>
+        <w:rPr>
+          <w:rFonts w:ascii="Carlito" w:hAnsi="Carlito" w:cs="Carlito"/>
+        </w:rPr>
+      </w:r>
     </w:p>
     <w:p>
       <w:pPr>
@@ -685,6 +757,11 @@
           <w:rFonts w:ascii="Carlito" w:hAnsi="Carlito" w:eastAsia="Carlito" w:cs="Carlito"/>
         </w:rPr>
       </w:r>
+      <w:r>
+        <w:rPr>
+          <w:rFonts w:ascii="Carlito" w:hAnsi="Carlito" w:cs="Carlito"/>
+        </w:rPr>
+      </w:r>
     </w:p>
     <w:p>
       <w:pPr>
@@ -704,6 +781,11 @@
       <w:r>
         <w:rPr>
           <w:rFonts w:ascii="Carlito" w:hAnsi="Carlito" w:eastAsia="Carlito" w:cs="Carlito"/>
+        </w:rPr>
+      </w:r>
+      <w:r>
+        <w:rPr>
+          <w:rFonts w:ascii="Carlito" w:hAnsi="Carlito" w:cs="Carlito"/>
         </w:rPr>
       </w:r>
     </w:p>
@@ -732,7 +814,7 @@
       </w:r>
       <w:r>
         <w:rPr>
-          <w:rFonts w:ascii="Carlito" w:hAnsi="Carlito" w:eastAsia="Carlito" w:cs="Carlito"/>
+          <w:rFonts w:ascii="Carlito" w:hAnsi="Carlito" w:cs="Carlito"/>
           <w:u w:val="single"/>
         </w:rPr>
       </w:r>
@@ -757,6 +839,11 @@
           <w:rFonts w:ascii="Carlito" w:hAnsi="Carlito" w:eastAsia="Carlito" w:cs="Carlito"/>
         </w:rPr>
       </w:r>
+      <w:r>
+        <w:rPr>
+          <w:rFonts w:ascii="Carlito" w:hAnsi="Carlito" w:cs="Carlito"/>
+        </w:rPr>
+      </w:r>
     </w:p>
     <w:p>
       <w:pPr>
@@ -775,6 +862,11 @@
       <w:r>
         <w:rPr>
           <w:rFonts w:ascii="Carlito" w:hAnsi="Carlito" w:eastAsia="Carlito" w:cs="Carlito"/>
+        </w:rPr>
+      </w:r>
+      <w:r>
+        <w:rPr>
+          <w:rFonts w:ascii="Carlito" w:hAnsi="Carlito" w:cs="Carlito"/>
         </w:rPr>
       </w:r>
     </w:p>
@@ -798,6 +890,11 @@
           <w:rFonts w:ascii="Carlito" w:hAnsi="Carlito" w:eastAsia="Carlito" w:cs="Carlito"/>
         </w:rPr>
       </w:r>
+      <w:r>
+        <w:rPr>
+          <w:rFonts w:ascii="Carlito" w:hAnsi="Carlito" w:cs="Carlito"/>
+        </w:rPr>
+      </w:r>
     </w:p>
     <w:p>
       <w:pPr>
@@ -819,6 +916,11 @@
           <w:rFonts w:ascii="Carlito" w:hAnsi="Carlito" w:eastAsia="Carlito" w:cs="Carlito"/>
         </w:rPr>
       </w:r>
+      <w:r>
+        <w:rPr>
+          <w:rFonts w:ascii="Carlito" w:hAnsi="Carlito" w:cs="Carlito"/>
+        </w:rPr>
+      </w:r>
     </w:p>
     <w:p>
       <w:pPr>
@@ -837,6 +939,11 @@
       <w:r>
         <w:rPr>
           <w:rFonts w:ascii="Carlito" w:hAnsi="Carlito" w:eastAsia="Carlito" w:cs="Carlito"/>
+        </w:rPr>
+      </w:r>
+      <w:r>
+        <w:rPr>
+          <w:rFonts w:ascii="Carlito" w:hAnsi="Carlito" w:cs="Carlito"/>
         </w:rPr>
       </w:r>
     </w:p>
@@ -902,6 +1009,12 @@
       <w:r>
         <w:rPr>
           <w:rFonts w:ascii="Carlito" w:hAnsi="Carlito" w:eastAsia="Carlito" w:cs="Carlito"/>
+          <w:b/>
+          <w:bCs/>
+          <w:sz w:val="38"/>
+          <w:szCs w:val="38"/>
+          <w:highlight w:val="none"/>
+          <w:lang w:val="en-US"/>
         </w:rPr>
       </w:r>
     </w:p>
@@ -922,6 +1035,11 @@
       <w:r>
         <w:rPr>
           <w:rFonts w:ascii="Carlito" w:hAnsi="Carlito" w:eastAsia="Carlito" w:cs="Carlito"/>
+        </w:rPr>
+      </w:r>
+      <w:r>
+        <w:rPr>
+          <w:rFonts w:ascii="Carlito" w:hAnsi="Carlito" w:cs="Carlito"/>
         </w:rPr>
       </w:r>
     </w:p>
@@ -945,6 +1063,11 @@
           <w:rFonts w:ascii="Carlito" w:hAnsi="Carlito" w:eastAsia="Carlito" w:cs="Carlito"/>
         </w:rPr>
       </w:r>
+      <w:r>
+        <w:rPr>
+          <w:rFonts w:ascii="Carlito" w:hAnsi="Carlito" w:cs="Carlito"/>
+        </w:rPr>
+      </w:r>
     </w:p>
     <w:p>
       <w:pPr>
@@ -963,7 +1086,7 @@
           <w:b/>
           <w:bCs/>
         </w:rPr>
-        <w:t xml:space="preserve">{{ notiz.AUTHOR }} – {{ notiz.AMT }}</w:t>
+        <w:t xml:space="preserve">{{ notiz.AUTHOR }} – {{ notiz.ORGANISATION }}</w:t>
       </w:r>
       <w:r>
         <w:rPr>
@@ -974,7 +1097,7 @@
       </w:r>
       <w:r>
         <w:rPr>
-          <w:rFonts w:ascii="Carlito" w:hAnsi="Carlito" w:eastAsia="Carlito" w:cs="Carlito"/>
+          <w:rFonts w:ascii="Carlito" w:hAnsi="Carlito" w:cs="Carlito"/>
           <w:b/>
           <w:bCs/>
         </w:rPr>
@@ -1002,6 +1125,12 @@
           <w:highlight w:val="none"/>
         </w:rPr>
       </w:r>
+      <w:r>
+        <w:rPr>
+          <w:rFonts w:ascii="Carlito" w:hAnsi="Carlito" w:cs="Carlito"/>
+          <w:highlight w:val="none"/>
+        </w:rPr>
+      </w:r>
     </w:p>
     <w:p>
       <w:pPr>
@@ -1012,12 +1141,6 @@
           <w:rFonts w:ascii="Carlito" w:hAnsi="Carlito" w:cs="Carlito"/>
         </w:rPr>
       </w:pPr>
-      <w:r>
-        <w:rPr>
-          <w:rFonts w:ascii="Carlito" w:hAnsi="Carlito" w:eastAsia="Carlito" w:cs="Carlito"/>
-          <w:highlight w:val="none"/>
-        </w:rPr>
-      </w:r>
       <w:r>
         <w:rPr>
           <w:rFonts w:ascii="Carlito" w:hAnsi="Carlito" w:eastAsia="Carlito" w:cs="Carlito"/>
@@ -1029,6 +1152,11 @@
           <w:rFonts w:ascii="Carlito" w:hAnsi="Carlito" w:eastAsia="Carlito" w:cs="Carlito"/>
         </w:rPr>
       </w:r>
+      <w:r>
+        <w:rPr>
+          <w:rFonts w:ascii="Carlito" w:hAnsi="Carlito" w:cs="Carlito"/>
+        </w:rPr>
+      </w:r>
     </w:p>
     <w:p>
       <w:pPr>
@@ -1049,6 +1177,12 @@
       <w:r>
         <w:rPr>
           <w:rFonts w:ascii="Carlito" w:hAnsi="Carlito" w:eastAsia="Carlito" w:cs="Carlito"/>
+          <w:highlight w:val="none"/>
+        </w:rPr>
+      </w:r>
+      <w:r>
+        <w:rPr>
+          <w:rFonts w:ascii="Carlito" w:hAnsi="Carlito" w:cs="Carlito"/>
           <w:highlight w:val="none"/>
         </w:rPr>
       </w:r>
@@ -1140,9 +1274,60 @@
         <w:sz w:val="20"/>
         <w:szCs w:val="20"/>
       </w:rPr>
-      <w:t xml:space="preserve">Dossier-Nr. {{ dossierNr }}</w:t>
+      <w:t xml:space="preserve">Dossier-Nr. {{ </w:t>
+    </w:r>
+    <w:r>
+      <w:rPr>
+        <w:rFonts w:ascii="Carlito" w:hAnsi="Carlito"/>
+        <w:sz w:val="20"/>
+        <w:szCs w:val="20"/>
+      </w:rPr>
+      <w:t xml:space="preserve">DOSSIER_NUMBER</w:t>
+    </w:r>
+    <w:r>
+      <w:rPr>
+        <w:rFonts w:ascii="Carlito" w:hAnsi="Carlito"/>
+        <w:sz w:val="20"/>
+        <w:szCs w:val="20"/>
+        <w:lang w:val="en-US"/>
+      </w:rPr>
+      <w:t xml:space="preserve"> </w:t>
+    </w:r>
+    <w:r>
+      <w:rPr>
+        <w:rFonts w:ascii="Carlito" w:hAnsi="Carlito"/>
+        <w:sz w:val="20"/>
+        <w:szCs w:val="20"/>
+      </w:rPr>
+      <w:t xml:space="preserve">}}</w:t>
       <w:tab/>
-      <w:t xml:space="preserve">ID {{ caseId }}</w:t>
+      <w:t xml:space="preserve">ID {{ </w:t>
+    </w:r>
+    <w:r>
+      <w:rPr>
+        <w:rFonts w:ascii="Carlito" w:hAnsi="Carlito"/>
+        <w:sz w:val="20"/>
+        <w:szCs w:val="20"/>
+        <w:lang w:val="en-US"/>
+      </w:rPr>
+      <w:t xml:space="preserve">ID</w:t>
+    </w:r>
+    <w:r>
+      <w:rPr>
+        <w:rFonts w:ascii="Carlito" w:hAnsi="Carlito"/>
+        <w:sz w:val="20"/>
+        <w:szCs w:val="20"/>
+        <w:lang w:val="en-US"/>
+      </w:rPr>
+      <w:t xml:space="preserve"> </w:t>
+    </w:r>
+    <w:r>
+      <w:rPr>
+        <w:rFonts w:ascii="Carlito" w:hAnsi="Carlito"/>
+        <w:sz w:val="20"/>
+        <w:szCs w:val="20"/>
+      </w:rPr>
+      <w:t xml:space="preserve">}}</w:t>
       <w:tab/>
       <w:t xml:space="preserve">Seite </w:t>
     </w:r>
@@ -1288,9 +1473,9 @@
         <w:sz w:val="20"/>
         <w:szCs w:val="20"/>
       </w:rPr>
-      <w:t xml:space="preserve">Dossier-Nr. {{ dossierNr }}</w:t>
+      <w:t xml:space="preserve">Dossier-Nr. {{ DOSSIER_NUMBER }}</w:t>
       <w:tab/>
-      <w:t xml:space="preserve">ID {{ caseId }}</w:t>
+      <w:t xml:space="preserve">ID {{ ID }}</w:t>
       <w:tab/>
       <w:t xml:space="preserve">Seite </w:t>
     </w:r>

</xml_diff>

<commit_message>
chore(ebbw): update archive template with new placeholders
</commit_message>
<xml_diff>
--- a/document-merge-service/kt_gr/templatefiles/archiv_ebbw_de.docx
+++ b/document-merge-service/kt_gr/templatefiles/archiv_ebbw_de.docx
@@ -469,742 +469,2140 @@
     </w:p>
     <w:p>
       <w:pPr>
-        <w:pStyle w:val="945"/>
-        <w:pBdr/>
-        <w:spacing/>
-        <w:ind/>
-        <w:jc w:val="left"/>
-        <w:rPr>
-          <w:rFonts w:ascii="Carlito" w:hAnsi="Carlito"/>
-          <w:highlight w:val="none"/>
-        </w:rPr>
-      </w:pPr>
-      <w:r>
-        <w:rPr>
-          <w:rFonts w:ascii="Carlito" w:cs="Carlito"/>
-          <w:b/>
-          <w:bCs/>
-          <w:sz w:val="38"/>
-          <w:szCs w:val="38"/>
-          <w:highlight w:val="none"/>
-          <w:lang w:val="en-US"/>
-        </w:rPr>
-      </w:r>
+        <w:keepNext/>
+        <w:spacing w:before="320" w:after="140" w:line="252" w:lineRule="auto"/>
+      </w:pPr>
       <w:r>
         <w:rPr>
           <w:rFonts w:ascii="Carlito" w:hAnsi="Carlito"/>
-          <w:highlight w:val="none"/>
+          <w:b/>
+          <w:i w:val="0"/>
+          <w:color w:val="000000"/>
+          <w:sz w:val="38"/>
         </w:rPr>
+        <w:t>Verknüpfte Dossiers</w:t>
       </w:r>
+    </w:p>
+    <w:p>
+      <w:pPr>
+        <w:keepNext w:val="0"/>
+        <w:spacing w:before="0" w:after="0" w:line="252" w:lineRule="auto"/>
+      </w:pPr>
       <w:r>
         <w:rPr>
           <w:rFonts w:ascii="Carlito" w:hAnsi="Carlito"/>
-          <w:highlight w:val="none"/>
+          <w:b w:val="0"/>
+          <w:i w:val="0"/>
+          <w:color w:val="7F7F7F"/>
+          <w:sz w:val="16"/>
         </w:rPr>
+        <w:t>{%p if VERKNUEPFTE_DOSSIERS %}</w:t>
+      </w:r>
+    </w:p>
+    <w:tbl>
+      <w:tblPr>
+        <w:tblW w:type="auto" w:w="0"/>
+        <w:tblLayout w:type="fixed"/>
+        <w:tblLook w:firstColumn="1" w:firstRow="1" w:lastColumn="0" w:lastRow="0" w:noHBand="0" w:noVBand="1" w:val="04A0"/>
+        <w:tblBorders>
+          <w:top w:val="single" w:sz="8" w:space="0" w:color="000000"/>
+          <w:left w:val="single" w:sz="8" w:space="0" w:color="000000"/>
+          <w:bottom w:val="single" w:sz="8" w:space="0" w:color="000000"/>
+          <w:right w:val="single" w:sz="8" w:space="0" w:color="000000"/>
+          <w:insideH w:val="single" w:sz="8" w:space="0" w:color="000000"/>
+          <w:insideV w:val="single" w:sz="8" w:space="0" w:color="000000"/>
+        </w:tblBorders>
+      </w:tblPr>
+      <w:tblGrid>
+        <w:gridCol w:w="4819"/>
+        <w:gridCol w:w="4819"/>
+      </w:tblGrid>
+      <w:tr>
+        <w:trPr>
+          <w:tblHeader w:val="true"/>
+        </w:trPr>
+        <w:tc>
+          <w:tcPr>
+            <w:tcW w:type="dxa" w:w="2438"/>
+            <w:vAlign w:val="center"/>
+            <w:tcMar>
+              <w:top w:w="85" w:type="dxa"/>
+              <w:start w:w="57" w:type="dxa"/>
+              <w:bottom w:w="85" w:type="dxa"/>
+              <w:end w:w="85" w:type="dxa"/>
+            </w:tcMar>
+          </w:tcPr>
+          <w:p>
+            <w:pPr>
+              <w:keepNext w:val="0"/>
+              <w:spacing w:before="0" w:after="0" w:line="252" w:lineRule="auto"/>
+              <w:jc w:val="left"/>
+            </w:pPr>
+            <w:r/>
+            <w:r>
+              <w:rPr>
+                <w:rFonts w:ascii="Carlito" w:hAnsi="Carlito"/>
+                <w:b/>
+                <w:i w:val="0"/>
+                <w:color w:val="000000"/>
+                <w:sz w:val="24"/>
+              </w:rPr>
+              <w:t>Dossier-Nr.</w:t>
+            </w:r>
+          </w:p>
+        </w:tc>
+        <w:tc>
+          <w:tcPr>
+            <w:tcW w:type="dxa" w:w="6803"/>
+            <w:vAlign w:val="center"/>
+            <w:tcMar>
+              <w:top w:w="85" w:type="dxa"/>
+              <w:start w:w="57" w:type="dxa"/>
+              <w:bottom w:w="85" w:type="dxa"/>
+              <w:end w:w="85" w:type="dxa"/>
+            </w:tcMar>
+          </w:tcPr>
+          <w:p>
+            <w:pPr>
+              <w:keepNext w:val="0"/>
+              <w:spacing w:before="0" w:after="0" w:line="252" w:lineRule="auto"/>
+              <w:jc w:val="left"/>
+            </w:pPr>
+            <w:r/>
+            <w:r>
+              <w:rPr>
+                <w:rFonts w:ascii="Carlito" w:hAnsi="Carlito"/>
+                <w:b/>
+                <w:i w:val="0"/>
+                <w:color w:val="000000"/>
+                <w:sz w:val="24"/>
+              </w:rPr>
+              <w:t>Dossiertyp</w:t>
+            </w:r>
+          </w:p>
+        </w:tc>
+      </w:tr>
+      <w:tr>
+        <w:tc>
+          <w:tcPr>
+            <w:tcW w:type="dxa" w:w="2438"/>
+            <w:vAlign w:val="center"/>
+            <w:tcMar>
+              <w:top w:w="85" w:type="dxa"/>
+              <w:start w:w="57" w:type="dxa"/>
+              <w:bottom w:w="85" w:type="dxa"/>
+              <w:end w:w="85" w:type="dxa"/>
+            </w:tcMar>
+          </w:tcPr>
+          <w:p>
+            <w:pPr>
+              <w:keepNext w:val="0"/>
+              <w:spacing w:before="0" w:after="0" w:line="252" w:lineRule="auto"/>
+              <w:jc w:val="left"/>
+            </w:pPr>
+            <w:r/>
+            <w:r>
+              <w:rPr>
+                <w:rFonts w:ascii="Carlito" w:hAnsi="Carlito"/>
+                <w:b w:val="0"/>
+                <w:i w:val="0"/>
+                <w:color w:val="000000"/>
+                <w:sz w:val="24"/>
+              </w:rPr>
+              <w:t>{%tr for dossier in VERKNUEPFTE_DOSSIERS %}</w:t>
+            </w:r>
+          </w:p>
+        </w:tc>
+        <w:tc>
+          <w:tcPr>
+            <w:tcW w:type="dxa" w:w="6803"/>
+            <w:vAlign w:val="center"/>
+            <w:tcMar>
+              <w:top w:w="85" w:type="dxa"/>
+              <w:start w:w="57" w:type="dxa"/>
+              <w:bottom w:w="85" w:type="dxa"/>
+              <w:end w:w="85" w:type="dxa"/>
+            </w:tcMar>
+          </w:tcPr>
+          <w:p>
+            <w:pPr>
+              <w:keepNext w:val="0"/>
+              <w:spacing w:before="0" w:after="0" w:line="252" w:lineRule="auto"/>
+              <w:jc w:val="left"/>
+            </w:pPr>
+            <w:r/>
+            <w:r>
+              <w:rPr>
+                <w:rFonts w:ascii="Carlito" w:hAnsi="Carlito"/>
+                <w:b w:val="0"/>
+                <w:i w:val="0"/>
+                <w:color w:val="000000"/>
+                <w:sz w:val="24"/>
+              </w:rPr>
+            </w:r>
+          </w:p>
+        </w:tc>
+      </w:tr>
+      <w:tr>
+        <w:trPr>
+          <w:cantSplit w:val="true"/>
+        </w:trPr>
+        <w:tc>
+          <w:tcPr>
+            <w:tcW w:type="dxa" w:w="2438"/>
+            <w:vAlign w:val="center"/>
+            <w:tcMar>
+              <w:top w:w="85" w:type="dxa"/>
+              <w:start w:w="57" w:type="dxa"/>
+              <w:bottom w:w="85" w:type="dxa"/>
+              <w:end w:w="85" w:type="dxa"/>
+            </w:tcMar>
+          </w:tcPr>
+          <w:p>
+            <w:pPr>
+              <w:keepNext w:val="0"/>
+              <w:spacing w:before="0" w:after="0" w:line="252" w:lineRule="auto"/>
+              <w:jc w:val="left"/>
+            </w:pPr>
+            <w:r/>
+            <w:r>
+              <w:rPr>
+                <w:rFonts w:ascii="Carlito" w:hAnsi="Carlito"/>
+                <w:b w:val="0"/>
+                <w:i w:val="0"/>
+                <w:color w:val="000000"/>
+                <w:sz w:val="24"/>
+              </w:rPr>
+              <w:t>{{ dossier.DOSSIER_NUMMER }}</w:t>
+            </w:r>
+          </w:p>
+        </w:tc>
+        <w:tc>
+          <w:tcPr>
+            <w:tcW w:type="dxa" w:w="6803"/>
+            <w:vAlign w:val="center"/>
+            <w:tcMar>
+              <w:top w:w="85" w:type="dxa"/>
+              <w:start w:w="57" w:type="dxa"/>
+              <w:bottom w:w="85" w:type="dxa"/>
+              <w:end w:w="85" w:type="dxa"/>
+            </w:tcMar>
+          </w:tcPr>
+          <w:p>
+            <w:pPr>
+              <w:keepNext w:val="0"/>
+              <w:spacing w:before="0" w:after="0" w:line="252" w:lineRule="auto"/>
+              <w:jc w:val="left"/>
+            </w:pPr>
+            <w:r/>
+            <w:r>
+              <w:rPr>
+                <w:rFonts w:ascii="Carlito" w:hAnsi="Carlito"/>
+                <w:b w:val="0"/>
+                <w:i w:val="0"/>
+                <w:color w:val="000000"/>
+                <w:sz w:val="24"/>
+              </w:rPr>
+              <w:t>{{ dossier.DOSSIER_TYP }}</w:t>
+            </w:r>
+          </w:p>
+        </w:tc>
+      </w:tr>
+      <w:tr>
+        <w:tc>
+          <w:tcPr>
+            <w:tcW w:type="dxa" w:w="2438"/>
+            <w:vAlign w:val="center"/>
+            <w:tcMar>
+              <w:top w:w="85" w:type="dxa"/>
+              <w:start w:w="57" w:type="dxa"/>
+              <w:bottom w:w="85" w:type="dxa"/>
+              <w:end w:w="85" w:type="dxa"/>
+            </w:tcMar>
+          </w:tcPr>
+          <w:p>
+            <w:pPr>
+              <w:keepNext w:val="0"/>
+              <w:spacing w:before="0" w:after="0" w:line="252" w:lineRule="auto"/>
+              <w:jc w:val="left"/>
+            </w:pPr>
+            <w:r/>
+            <w:r>
+              <w:rPr>
+                <w:rFonts w:ascii="Carlito" w:hAnsi="Carlito"/>
+                <w:b w:val="0"/>
+                <w:i w:val="0"/>
+                <w:color w:val="000000"/>
+                <w:sz w:val="24"/>
+              </w:rPr>
+              <w:t>{%tr endfor %}</w:t>
+            </w:r>
+          </w:p>
+        </w:tc>
+        <w:tc>
+          <w:tcPr>
+            <w:tcW w:type="dxa" w:w="6803"/>
+            <w:vAlign w:val="center"/>
+            <w:tcMar>
+              <w:top w:w="85" w:type="dxa"/>
+              <w:start w:w="57" w:type="dxa"/>
+              <w:bottom w:w="85" w:type="dxa"/>
+              <w:end w:w="85" w:type="dxa"/>
+            </w:tcMar>
+          </w:tcPr>
+          <w:p>
+            <w:pPr>
+              <w:keepNext w:val="0"/>
+              <w:spacing w:before="0" w:after="0" w:line="252" w:lineRule="auto"/>
+              <w:jc w:val="left"/>
+            </w:pPr>
+            <w:r/>
+            <w:r>
+              <w:rPr>
+                <w:rFonts w:ascii="Carlito" w:hAnsi="Carlito"/>
+                <w:b w:val="0"/>
+                <w:i w:val="0"/>
+                <w:color w:val="000000"/>
+                <w:sz w:val="24"/>
+              </w:rPr>
+            </w:r>
+          </w:p>
+        </w:tc>
+      </w:tr>
+    </w:tbl>
+    <w:p>
+      <w:pPr>
+        <w:keepNext w:val="0"/>
+        <w:spacing w:before="0" w:after="40" w:line="252" w:lineRule="auto"/>
+      </w:pPr>
+    </w:p>
+    <w:p>
+      <w:pPr>
+        <w:keepNext w:val="0"/>
+        <w:spacing w:before="0" w:after="0" w:line="252" w:lineRule="auto"/>
+      </w:pPr>
+      <w:r>
+        <w:rPr>
+          <w:rFonts w:ascii="Carlito" w:hAnsi="Carlito"/>
+          <w:b w:val="0"/>
+          <w:i w:val="0"/>
+          <w:color w:val="7F7F7F"/>
+          <w:sz w:val="16"/>
+        </w:rPr>
+        <w:t>{%p else %}</w:t>
       </w:r>
     </w:p>
     <w:p>
       <w:pPr>
-        <w:pStyle w:val="945"/>
-        <w:pBdr/>
-        <w:spacing/>
-        <w:ind/>
-        <w:jc w:val="left"/>
-        <w:rPr>
-          <w:rFonts w:ascii="Carlito" w:cs="Carlito"/>
-          <w:b/>
-          <w:bCs/>
-          <w:sz w:val="38"/>
-          <w:szCs w:val="38"/>
-          <w:highlight w:val="none"/>
-          <w:lang w:val="en-US"/>
-        </w:rPr>
+        <w:keepNext w:val="0"/>
+        <w:spacing w:before="0" w:after="60" w:line="252" w:lineRule="auto"/>
       </w:pPr>
       <w:r>
         <w:rPr>
-          <w:rFonts w:ascii="Carlito" w:cs="Carlito"/>
-          <w:b/>
-          <w:bCs/>
-          <w:sz w:val="38"/>
-          <w:szCs w:val="38"/>
-          <w:highlight w:val="none"/>
-          <w:lang w:val="en-US"/>
+          <w:rFonts w:ascii="Carlito" w:hAnsi="Carlito"/>
+          <w:b w:val="0"/>
+          <w:i/>
+          <w:color w:val="000000"/>
+          <w:sz w:val="24"/>
         </w:rPr>
-      </w:r>
-      <w:r>
-        <w:rPr>
-          <w:rFonts w:ascii="Carlito" w:cs="Carlito"/>
-          <w:b/>
-          <w:bCs/>
-          <w:sz w:val="38"/>
-          <w:szCs w:val="38"/>
-          <w:highlight w:val="none"/>
-          <w:lang w:val="en-US"/>
-        </w:rPr>
-      </w:r>
-      <w:r>
-        <w:rPr>
-          <w:rFonts w:ascii="Carlito" w:cs="Carlito"/>
-          <w:b/>
-          <w:bCs/>
-          <w:sz w:val="38"/>
-          <w:szCs w:val="38"/>
-          <w:highlight w:val="none"/>
-          <w:lang w:val="en-US"/>
-        </w:rPr>
+        <w:t>Keine Daten vorhanden.</w:t>
       </w:r>
     </w:p>
     <w:p>
       <w:pPr>
-        <w:pStyle w:val="945"/>
-        <w:pBdr/>
-        <w:spacing/>
-        <w:ind/>
-        <w:jc w:val="left"/>
-        <w:rPr>
-          <w:rFonts w:ascii="Carlito" w:cs="Carlito"/>
-          <w:b/>
-          <w:bCs/>
-          <w:sz w:val="38"/>
-          <w:szCs w:val="38"/>
-          <w:highlight w:val="none"/>
-          <w:lang w:val="en-US"/>
-        </w:rPr>
+        <w:keepNext w:val="0"/>
+        <w:spacing w:before="0" w:after="0" w:line="252" w:lineRule="auto"/>
       </w:pPr>
       <w:r>
         <w:rPr>
-          <w:rFonts w:ascii="Carlito" w:cs="Carlito"/>
-          <w:b/>
-          <w:bCs/>
-          <w:sz w:val="38"/>
-          <w:szCs w:val="38"/>
-          <w:lang w:val="en-US"/>
+          <w:rFonts w:ascii="Carlito" w:hAnsi="Carlito"/>
+          <w:b w:val="0"/>
+          <w:i w:val="0"/>
+          <w:color w:val="7F7F7F"/>
+          <w:sz w:val="16"/>
         </w:rPr>
-        <w:t xml:space="preserve">Kommunikation</w:t>
-      </w:r>
-      <w:r>
-        <w:rPr>
-          <w:rFonts w:ascii="Carlito" w:cs="Carlito"/>
-          <w:b/>
-          <w:bCs/>
-          <w:sz w:val="38"/>
-          <w:szCs w:val="38"/>
-          <w:highlight w:val="none"/>
-          <w:lang w:val="en-US"/>
-        </w:rPr>
-      </w:r>
-      <w:r>
-        <w:rPr>
-          <w:rFonts w:ascii="Carlito" w:cs="Carlito"/>
-          <w:b/>
-          <w:bCs/>
-          <w:sz w:val="38"/>
-          <w:szCs w:val="38"/>
-          <w:highlight w:val="none"/>
-          <w:lang w:val="en-US"/>
-        </w:rPr>
+        <w:t>{%p endif %}</w:t>
       </w:r>
     </w:p>
     <w:p>
       <w:pPr>
-        <w:pStyle w:val="945"/>
-        <w:pBdr/>
-        <w:spacing/>
-        <w:ind/>
-        <w:jc w:val="left"/>
-        <w:rPr>
-          <w:rFonts w:ascii="Carlito" w:hAnsi="Carlito"/>
-        </w:rPr>
+        <w:keepNext/>
+        <w:spacing w:before="320" w:after="140" w:line="252" w:lineRule="auto"/>
       </w:pPr>
       <w:r>
         <w:rPr>
           <w:rFonts w:ascii="Carlito" w:hAnsi="Carlito"/>
-          <w:highlight w:val="none"/>
+          <w:b/>
+          <w:i w:val="0"/>
+          <w:color w:val="000000"/>
+          <w:sz w:val="38"/>
         </w:rPr>
+        <w:t>Kommunikation</w:t>
       </w:r>
+    </w:p>
+    <w:p>
+      <w:pPr>
+        <w:keepNext w:val="0"/>
+        <w:spacing w:before="0" w:after="0" w:line="252" w:lineRule="auto"/>
+      </w:pPr>
       <w:r>
         <w:rPr>
           <w:rFonts w:ascii="Carlito" w:hAnsi="Carlito"/>
+          <w:b w:val="0"/>
+          <w:i w:val="0"/>
+          <w:color w:val="7F7F7F"/>
+          <w:sz w:val="16"/>
         </w:rPr>
+        <w:t>{%p if KOMMUNIKATIONS_THEMEN %}</w:t>
       </w:r>
+    </w:p>
+    <w:p>
+      <w:pPr>
+        <w:keepNext w:val="0"/>
+        <w:spacing w:before="0" w:after="0" w:line="252" w:lineRule="auto"/>
+      </w:pPr>
       <w:r>
         <w:rPr>
           <w:rFonts w:ascii="Carlito" w:hAnsi="Carlito"/>
+          <w:b w:val="0"/>
+          <w:i w:val="0"/>
+          <w:color w:val="7F7F7F"/>
+          <w:sz w:val="16"/>
         </w:rPr>
+        <w:t>{%p for thema in KOMMUNIKATIONS_THEMEN %}</w:t>
       </w:r>
     </w:p>
     <w:p>
       <w:pPr>
-        <w:pBdr/>
-        <w:spacing/>
-        <w:ind/>
-        <w:rPr>
-          <w:rFonts w:ascii="Carlito" w:hAnsi="Carlito" w:cs="Carlito"/>
-          <w:highlight w:val="none"/>
-        </w:rPr>
+        <w:keepNext/>
+        <w:spacing w:before="100" w:after="40" w:line="252" w:lineRule="auto"/>
       </w:pPr>
       <w:r>
         <w:rPr>
-          <w:rFonts w:ascii="Carlito" w:hAnsi="Carlito" w:eastAsia="Carlito" w:cs="Carlito"/>
+          <w:rFonts w:ascii="Carlito" w:hAnsi="Carlito"/>
+          <w:b/>
+          <w:i w:val="0"/>
+          <w:color w:val="000000"/>
+          <w:sz w:val="24"/>
         </w:rPr>
-        <w:t xml:space="preserve">{% for thema in KOMMUNIKATIONS_THEMEN %}</w:t>
-      </w:r>
-      <w:r>
-        <w:rPr>
-          <w:rFonts w:ascii="Carlito" w:hAnsi="Carlito" w:eastAsia="Carlito" w:cs="Carlito"/>
-          <w:highlight w:val="none"/>
-        </w:rPr>
-      </w:r>
-      <w:r>
-        <w:rPr>
-          <w:rFonts w:ascii="Carlito" w:hAnsi="Carlito" w:cs="Carlito"/>
-          <w:highlight w:val="none"/>
-        </w:rPr>
+        <w:t>{{ thema.THEMA }}</w:t>
       </w:r>
     </w:p>
     <w:p>
       <w:pPr>
-        <w:pBdr/>
-        <w:spacing/>
-        <w:ind/>
-        <w:rPr>
-          <w:rFonts w:ascii="Carlito" w:hAnsi="Carlito" w:cs="Carlito"/>
-          <w:sz w:val="32"/>
-          <w:szCs w:val="32"/>
-        </w:rPr>
+        <w:keepNext/>
+        <w:spacing w:before="0" w:after="80" w:line="252" w:lineRule="auto"/>
       </w:pPr>
       <w:r>
         <w:rPr>
-          <w:rFonts w:ascii="Carlito" w:hAnsi="Carlito" w:eastAsia="Carlito" w:cs="Carlito"/>
-          <w:sz w:val="32"/>
-          <w:szCs w:val="32"/>
+          <w:rFonts w:ascii="Carlito" w:hAnsi="Carlito"/>
+          <w:b w:val="0"/>
+          <w:i w:val="0"/>
+          <w:color w:val="000000"/>
+          <w:sz w:val="24"/>
         </w:rPr>
-        <w:t xml:space="preserve">{{ thema.THEMA }}</w:t>
+        <w:t>Teilnehmende: {{ thema.TEILNEHMER }}</w:t>
       </w:r>
+    </w:p>
+    <w:tbl>
+      <w:tblPr>
+        <w:tblW w:type="auto" w:w="0"/>
+        <w:tblLayout w:type="fixed"/>
+        <w:tblLook w:firstColumn="1" w:firstRow="1" w:lastColumn="0" w:lastRow="0" w:noHBand="0" w:noVBand="1" w:val="04A0"/>
+        <w:tblBorders>
+          <w:top w:val="single" w:sz="8" w:space="0" w:color="000000"/>
+          <w:left w:val="single" w:sz="8" w:space="0" w:color="000000"/>
+          <w:bottom w:val="single" w:sz="8" w:space="0" w:color="000000"/>
+          <w:right w:val="single" w:sz="8" w:space="0" w:color="000000"/>
+          <w:insideH w:val="single" w:sz="8" w:space="0" w:color="000000"/>
+          <w:insideV w:val="single" w:sz="8" w:space="0" w:color="000000"/>
+        </w:tblBorders>
+      </w:tblPr>
+      <w:tblGrid>
+        <w:gridCol w:w="3213"/>
+        <w:gridCol w:w="3213"/>
+        <w:gridCol w:w="3213"/>
+      </w:tblGrid>
+      <w:tr>
+        <w:trPr>
+          <w:tblHeader w:val="true"/>
+        </w:trPr>
+        <w:tc>
+          <w:tcPr>
+            <w:tcW w:type="dxa" w:w="1928"/>
+            <w:vAlign w:val="center"/>
+            <w:tcMar>
+              <w:top w:w="85" w:type="dxa"/>
+              <w:start w:w="57" w:type="dxa"/>
+              <w:bottom w:w="85" w:type="dxa"/>
+              <w:end w:w="85" w:type="dxa"/>
+            </w:tcMar>
+          </w:tcPr>
+          <w:p>
+            <w:pPr>
+              <w:keepNext w:val="0"/>
+              <w:spacing w:before="0" w:after="0" w:line="252" w:lineRule="auto"/>
+              <w:jc w:val="left"/>
+            </w:pPr>
+            <w:r/>
+            <w:r>
+              <w:rPr>
+                <w:rFonts w:ascii="Carlito" w:hAnsi="Carlito"/>
+                <w:b/>
+                <w:i w:val="0"/>
+                <w:color w:val="000000"/>
+                <w:sz w:val="24"/>
+              </w:rPr>
+              <w:t>Datum</w:t>
+            </w:r>
+          </w:p>
+        </w:tc>
+        <w:tc>
+          <w:tcPr>
+            <w:tcW w:type="dxa" w:w="2268"/>
+            <w:vAlign w:val="center"/>
+            <w:tcMar>
+              <w:top w:w="85" w:type="dxa"/>
+              <w:start w:w="57" w:type="dxa"/>
+              <w:bottom w:w="85" w:type="dxa"/>
+              <w:end w:w="85" w:type="dxa"/>
+            </w:tcMar>
+          </w:tcPr>
+          <w:p>
+            <w:pPr>
+              <w:keepNext w:val="0"/>
+              <w:spacing w:before="0" w:after="0" w:line="252" w:lineRule="auto"/>
+              <w:jc w:val="left"/>
+            </w:pPr>
+            <w:r/>
+            <w:r>
+              <w:rPr>
+                <w:rFonts w:ascii="Carlito" w:hAnsi="Carlito"/>
+                <w:b/>
+                <w:i w:val="0"/>
+                <w:color w:val="000000"/>
+                <w:sz w:val="24"/>
+              </w:rPr>
+              <w:t>Absender</w:t>
+            </w:r>
+          </w:p>
+        </w:tc>
+        <w:tc>
+          <w:tcPr>
+            <w:tcW w:type="dxa" w:w="5046"/>
+            <w:vAlign w:val="center"/>
+            <w:tcMar>
+              <w:top w:w="85" w:type="dxa"/>
+              <w:start w:w="57" w:type="dxa"/>
+              <w:bottom w:w="85" w:type="dxa"/>
+              <w:end w:w="85" w:type="dxa"/>
+            </w:tcMar>
+          </w:tcPr>
+          <w:p>
+            <w:pPr>
+              <w:keepNext w:val="0"/>
+              <w:spacing w:before="0" w:after="0" w:line="252" w:lineRule="auto"/>
+              <w:jc w:val="left"/>
+            </w:pPr>
+            <w:r/>
+            <w:r>
+              <w:rPr>
+                <w:rFonts w:ascii="Carlito" w:hAnsi="Carlito"/>
+                <w:b/>
+                <w:i w:val="0"/>
+                <w:color w:val="000000"/>
+                <w:sz w:val="24"/>
+              </w:rPr>
+              <w:t>Nachricht</w:t>
+            </w:r>
+          </w:p>
+        </w:tc>
+      </w:tr>
+      <w:tr>
+        <w:tc>
+          <w:tcPr>
+            <w:tcW w:type="dxa" w:w="1928"/>
+            <w:vAlign w:val="center"/>
+            <w:tcMar>
+              <w:top w:w="85" w:type="dxa"/>
+              <w:start w:w="57" w:type="dxa"/>
+              <w:bottom w:w="85" w:type="dxa"/>
+              <w:end w:w="85" w:type="dxa"/>
+            </w:tcMar>
+          </w:tcPr>
+          <w:p>
+            <w:pPr>
+              <w:keepNext w:val="0"/>
+              <w:spacing w:before="0" w:after="0" w:line="252" w:lineRule="auto"/>
+              <w:jc w:val="left"/>
+            </w:pPr>
+            <w:r/>
+            <w:r>
+              <w:rPr>
+                <w:rFonts w:ascii="Carlito" w:hAnsi="Carlito"/>
+                <w:b w:val="0"/>
+                <w:i w:val="0"/>
+                <w:color w:val="000000"/>
+                <w:sz w:val="24"/>
+              </w:rPr>
+              <w:t>{%tr for nachricht in thema.NACHRICHTEN %}</w:t>
+            </w:r>
+          </w:p>
+        </w:tc>
+        <w:tc>
+          <w:tcPr>
+            <w:tcW w:type="dxa" w:w="2268"/>
+            <w:vAlign w:val="center"/>
+            <w:tcMar>
+              <w:top w:w="85" w:type="dxa"/>
+              <w:start w:w="57" w:type="dxa"/>
+              <w:bottom w:w="85" w:type="dxa"/>
+              <w:end w:w="85" w:type="dxa"/>
+            </w:tcMar>
+          </w:tcPr>
+          <w:p>
+            <w:pPr>
+              <w:keepNext w:val="0"/>
+              <w:spacing w:before="0" w:after="0" w:line="252" w:lineRule="auto"/>
+              <w:jc w:val="left"/>
+            </w:pPr>
+            <w:r/>
+            <w:r>
+              <w:rPr>
+                <w:rFonts w:ascii="Carlito" w:hAnsi="Carlito"/>
+                <w:b w:val="0"/>
+                <w:i w:val="0"/>
+                <w:color w:val="000000"/>
+                <w:sz w:val="24"/>
+              </w:rPr>
+            </w:r>
+          </w:p>
+        </w:tc>
+        <w:tc>
+          <w:tcPr>
+            <w:tcW w:type="dxa" w:w="5046"/>
+            <w:vAlign w:val="center"/>
+            <w:tcMar>
+              <w:top w:w="85" w:type="dxa"/>
+              <w:start w:w="57" w:type="dxa"/>
+              <w:bottom w:w="85" w:type="dxa"/>
+              <w:end w:w="85" w:type="dxa"/>
+            </w:tcMar>
+          </w:tcPr>
+          <w:p>
+            <w:pPr>
+              <w:keepNext w:val="0"/>
+              <w:spacing w:before="0" w:after="0" w:line="252" w:lineRule="auto"/>
+              <w:jc w:val="left"/>
+            </w:pPr>
+            <w:r/>
+            <w:r>
+              <w:rPr>
+                <w:rFonts w:ascii="Carlito" w:hAnsi="Carlito"/>
+                <w:b w:val="0"/>
+                <w:i w:val="0"/>
+                <w:color w:val="000000"/>
+                <w:sz w:val="24"/>
+              </w:rPr>
+            </w:r>
+          </w:p>
+        </w:tc>
+      </w:tr>
+      <w:tr>
+        <w:trPr>
+          <w:cantSplit w:val="true"/>
+        </w:trPr>
+        <w:tc>
+          <w:tcPr>
+            <w:tcW w:type="dxa" w:w="1928"/>
+            <w:vAlign w:val="center"/>
+            <w:tcMar>
+              <w:top w:w="85" w:type="dxa"/>
+              <w:start w:w="57" w:type="dxa"/>
+              <w:bottom w:w="85" w:type="dxa"/>
+              <w:end w:w="85" w:type="dxa"/>
+            </w:tcMar>
+          </w:tcPr>
+          <w:p>
+            <w:pPr>
+              <w:keepNext w:val="0"/>
+              <w:spacing w:before="0" w:after="0" w:line="252" w:lineRule="auto"/>
+              <w:jc w:val="left"/>
+            </w:pPr>
+            <w:r/>
+            <w:r>
+              <w:rPr>
+                <w:rFonts w:ascii="Carlito" w:hAnsi="Carlito"/>
+                <w:b w:val="0"/>
+                <w:i w:val="0"/>
+                <w:color w:val="000000"/>
+                <w:sz w:val="24"/>
+              </w:rPr>
+              <w:t>{{ nachricht.DATUMZEIT }}</w:t>
+            </w:r>
+          </w:p>
+        </w:tc>
+        <w:tc>
+          <w:tcPr>
+            <w:tcW w:type="dxa" w:w="2268"/>
+            <w:vAlign w:val="center"/>
+            <w:tcMar>
+              <w:top w:w="85" w:type="dxa"/>
+              <w:start w:w="57" w:type="dxa"/>
+              <w:bottom w:w="85" w:type="dxa"/>
+              <w:end w:w="85" w:type="dxa"/>
+            </w:tcMar>
+          </w:tcPr>
+          <w:p>
+            <w:pPr>
+              <w:keepNext w:val="0"/>
+              <w:spacing w:before="0" w:after="0" w:line="252" w:lineRule="auto"/>
+              <w:jc w:val="left"/>
+            </w:pPr>
+            <w:r/>
+            <w:r>
+              <w:rPr>
+                <w:rFonts w:ascii="Carlito" w:hAnsi="Carlito"/>
+                <w:b w:val="0"/>
+                <w:i w:val="0"/>
+                <w:color w:val="000000"/>
+                <w:sz w:val="24"/>
+              </w:rPr>
+              <w:t>{{ nachricht.SENDER }}</w:t>
+            </w:r>
+          </w:p>
+        </w:tc>
+        <w:tc>
+          <w:tcPr>
+            <w:tcW w:type="dxa" w:w="5046"/>
+            <w:vAlign w:val="center"/>
+            <w:tcMar>
+              <w:top w:w="85" w:type="dxa"/>
+              <w:start w:w="57" w:type="dxa"/>
+              <w:bottom w:w="85" w:type="dxa"/>
+              <w:end w:w="85" w:type="dxa"/>
+            </w:tcMar>
+          </w:tcPr>
+          <w:p>
+            <w:pPr>
+              <w:keepNext w:val="0"/>
+              <w:spacing w:before="0" w:after="0" w:line="252" w:lineRule="auto"/>
+              <w:jc w:val="left"/>
+            </w:pPr>
+            <w:r/>
+            <w:r>
+              <w:rPr>
+                <w:rFonts w:ascii="Carlito" w:hAnsi="Carlito"/>
+                <w:b w:val="0"/>
+                <w:i w:val="0"/>
+                <w:color w:val="000000"/>
+                <w:sz w:val="24"/>
+              </w:rPr>
+              <w:t>{{ nachricht.NACHRICHT }}</w:t>
+            </w:r>
+          </w:p>
+        </w:tc>
+      </w:tr>
+      <w:tr>
+        <w:tc>
+          <w:tcPr>
+            <w:tcW w:type="dxa" w:w="1928"/>
+            <w:vAlign w:val="center"/>
+            <w:tcMar>
+              <w:top w:w="85" w:type="dxa"/>
+              <w:start w:w="57" w:type="dxa"/>
+              <w:bottom w:w="85" w:type="dxa"/>
+              <w:end w:w="85" w:type="dxa"/>
+            </w:tcMar>
+          </w:tcPr>
+          <w:p>
+            <w:pPr>
+              <w:keepNext w:val="0"/>
+              <w:spacing w:before="0" w:after="0" w:line="252" w:lineRule="auto"/>
+              <w:jc w:val="left"/>
+            </w:pPr>
+            <w:r/>
+            <w:r>
+              <w:rPr>
+                <w:rFonts w:ascii="Carlito" w:hAnsi="Carlito"/>
+                <w:b w:val="0"/>
+                <w:i w:val="0"/>
+                <w:color w:val="000000"/>
+                <w:sz w:val="24"/>
+              </w:rPr>
+              <w:t>{%tr endfor %}</w:t>
+            </w:r>
+          </w:p>
+        </w:tc>
+        <w:tc>
+          <w:tcPr>
+            <w:tcW w:type="dxa" w:w="2268"/>
+            <w:vAlign w:val="center"/>
+            <w:tcMar>
+              <w:top w:w="85" w:type="dxa"/>
+              <w:start w:w="57" w:type="dxa"/>
+              <w:bottom w:w="85" w:type="dxa"/>
+              <w:end w:w="85" w:type="dxa"/>
+            </w:tcMar>
+          </w:tcPr>
+          <w:p>
+            <w:pPr>
+              <w:keepNext w:val="0"/>
+              <w:spacing w:before="0" w:after="0" w:line="252" w:lineRule="auto"/>
+              <w:jc w:val="left"/>
+            </w:pPr>
+            <w:r/>
+            <w:r>
+              <w:rPr>
+                <w:rFonts w:ascii="Carlito" w:hAnsi="Carlito"/>
+                <w:b w:val="0"/>
+                <w:i w:val="0"/>
+                <w:color w:val="000000"/>
+                <w:sz w:val="24"/>
+              </w:rPr>
+            </w:r>
+          </w:p>
+        </w:tc>
+        <w:tc>
+          <w:tcPr>
+            <w:tcW w:type="dxa" w:w="5046"/>
+            <w:vAlign w:val="center"/>
+            <w:tcMar>
+              <w:top w:w="85" w:type="dxa"/>
+              <w:start w:w="57" w:type="dxa"/>
+              <w:bottom w:w="85" w:type="dxa"/>
+              <w:end w:w="85" w:type="dxa"/>
+            </w:tcMar>
+          </w:tcPr>
+          <w:p>
+            <w:pPr>
+              <w:keepNext w:val="0"/>
+              <w:spacing w:before="0" w:after="0" w:line="252" w:lineRule="auto"/>
+              <w:jc w:val="left"/>
+            </w:pPr>
+            <w:r/>
+            <w:r>
+              <w:rPr>
+                <w:rFonts w:ascii="Carlito" w:hAnsi="Carlito"/>
+                <w:b w:val="0"/>
+                <w:i w:val="0"/>
+                <w:color w:val="000000"/>
+                <w:sz w:val="24"/>
+              </w:rPr>
+            </w:r>
+          </w:p>
+        </w:tc>
+      </w:tr>
+    </w:tbl>
+    <w:p>
+      <w:pPr>
+        <w:keepNext w:val="0"/>
+        <w:spacing w:before="0" w:after="40" w:line="252" w:lineRule="auto"/>
+      </w:pPr>
+    </w:p>
+    <w:p>
+      <w:pPr>
+        <w:keepNext w:val="0"/>
+        <w:spacing w:before="0" w:after="0" w:line="252" w:lineRule="auto"/>
+      </w:pPr>
       <w:r>
         <w:rPr>
-          <w:rFonts w:ascii="Carlito" w:hAnsi="Carlito" w:eastAsia="Carlito" w:cs="Carlito"/>
-          <w:sz w:val="32"/>
-          <w:szCs w:val="32"/>
+          <w:rFonts w:ascii="Carlito" w:hAnsi="Carlito"/>
+          <w:b w:val="0"/>
+          <w:i w:val="0"/>
+          <w:color w:val="7F7F7F"/>
+          <w:sz w:val="16"/>
         </w:rPr>
-        <w:br/>
-      </w:r>
-      <w:r>
-        <w:rPr>
-          <w:rFonts w:ascii="Carlito" w:hAnsi="Carlito" w:eastAsia="Carlito" w:cs="Carlito"/>
-          <w:sz w:val="32"/>
-          <w:szCs w:val="32"/>
-        </w:rPr>
-      </w:r>
-      <w:r>
-        <w:rPr>
-          <w:rFonts w:ascii="Carlito" w:hAnsi="Carlito" w:cs="Carlito"/>
-          <w:sz w:val="32"/>
-          <w:szCs w:val="32"/>
-        </w:rPr>
+        <w:t>{%p endfor %}</w:t>
       </w:r>
     </w:p>
     <w:p>
       <w:pPr>
-        <w:pBdr/>
-        <w:spacing/>
-        <w:ind/>
-        <w:rPr>
-          <w:rFonts w:ascii="Carlito" w:hAnsi="Carlito" w:cs="Carlito"/>
-        </w:rPr>
+        <w:keepNext w:val="0"/>
+        <w:spacing w:before="0" w:after="0" w:line="252" w:lineRule="auto"/>
       </w:pPr>
       <w:r>
         <w:rPr>
-          <w:rFonts w:ascii="Carlito" w:hAnsi="Carlito" w:eastAsia="Carlito" w:cs="Carlito"/>
-          <w:b/>
-          <w:bCs/>
+          <w:rFonts w:ascii="Carlito" w:hAnsi="Carlito"/>
+          <w:b w:val="0"/>
+          <w:i w:val="0"/>
+          <w:color w:val="7F7F7F"/>
+          <w:sz w:val="16"/>
         </w:rPr>
-        <w:t xml:space="preserve">Teilnehmende:</w:t>
-      </w:r>
-      <w:r>
-        <w:rPr>
-          <w:rFonts w:ascii="Carlito" w:hAnsi="Carlito" w:eastAsia="Carlito" w:cs="Carlito"/>
-        </w:rPr>
-        <w:t xml:space="preserve"> {{ thema.TEILNEHMER }}</w:t>
-      </w:r>
-      <w:r>
-        <w:rPr>
-          <w:rFonts w:ascii="Carlito" w:hAnsi="Carlito" w:eastAsia="Carlito" w:cs="Carlito"/>
-        </w:rPr>
-      </w:r>
-      <w:r>
-        <w:rPr>
-          <w:rFonts w:ascii="Carlito" w:hAnsi="Carlito" w:cs="Carlito"/>
-        </w:rPr>
+        <w:t>{%p else %}</w:t>
       </w:r>
     </w:p>
     <w:p>
       <w:pPr>
-        <w:pBdr/>
-        <w:spacing/>
-        <w:ind/>
-        <w:rPr>
-          <w:rFonts w:ascii="Carlito" w:hAnsi="Carlito" w:cs="Carlito"/>
-        </w:rPr>
+        <w:keepNext w:val="0"/>
+        <w:spacing w:before="0" w:after="60" w:line="252" w:lineRule="auto"/>
       </w:pPr>
       <w:r>
         <w:rPr>
-          <w:rFonts w:ascii="Carlito" w:hAnsi="Carlito" w:eastAsia="Carlito" w:cs="Carlito"/>
+          <w:rFonts w:ascii="Carlito" w:hAnsi="Carlito"/>
+          <w:b w:val="0"/>
+          <w:i/>
+          <w:color w:val="000000"/>
+          <w:sz w:val="24"/>
         </w:rPr>
-      </w:r>
-      <w:r>
-        <w:rPr>
-          <w:rFonts w:ascii="Carlito" w:hAnsi="Carlito" w:eastAsia="Carlito" w:cs="Carlito"/>
-        </w:rPr>
-      </w:r>
-      <w:r>
-        <w:rPr>
-          <w:rFonts w:ascii="Carlito" w:hAnsi="Carlito" w:cs="Carlito"/>
-        </w:rPr>
+        <w:t>Keine Daten vorhanden.</w:t>
       </w:r>
     </w:p>
     <w:p>
       <w:pPr>
-        <w:pBdr/>
-        <w:spacing/>
-        <w:ind/>
-        <w:rPr>
-          <w:rFonts w:ascii="Carlito" w:hAnsi="Carlito" w:cs="Carlito"/>
-        </w:rPr>
+        <w:keepNext w:val="0"/>
+        <w:spacing w:before="0" w:after="0" w:line="252" w:lineRule="auto"/>
       </w:pPr>
       <w:r>
         <w:rPr>
-          <w:rFonts w:ascii="Carlito" w:hAnsi="Carlito" w:eastAsia="Carlito" w:cs="Carlito"/>
+          <w:rFonts w:ascii="Carlito" w:hAnsi="Carlito"/>
+          <w:b w:val="0"/>
+          <w:i w:val="0"/>
+          <w:color w:val="7F7F7F"/>
+          <w:sz w:val="16"/>
         </w:rPr>
-        <w:t xml:space="preserve">{% for nachricht in thema.NACHRICHTEN %}</w:t>
-      </w:r>
-      <w:r>
-        <w:rPr>
-          <w:rFonts w:ascii="Carlito" w:hAnsi="Carlito" w:eastAsia="Carlito" w:cs="Carlito"/>
-        </w:rPr>
-      </w:r>
-      <w:r>
-        <w:rPr>
-          <w:rFonts w:ascii="Carlito" w:hAnsi="Carlito" w:cs="Carlito"/>
-        </w:rPr>
+        <w:t>{%p endif %}</w:t>
       </w:r>
     </w:p>
     <w:p>
       <w:pPr>
-        <w:pBdr/>
-        <w:spacing/>
-        <w:ind/>
-        <w:rPr>
-          <w:rFonts w:ascii="Carlito" w:hAnsi="Carlito" w:cs="Carlito"/>
-          <w:u w:val="single"/>
-        </w:rPr>
+        <w:keepNext/>
+        <w:spacing w:before="320" w:after="140" w:line="252" w:lineRule="auto"/>
       </w:pPr>
       <w:r>
         <w:rPr>
-          <w:rFonts w:ascii="Carlito" w:hAnsi="Carlito" w:eastAsia="Carlito" w:cs="Carlito"/>
-          <w:u w:val="single"/>
+          <w:rFonts w:ascii="Carlito" w:hAnsi="Carlito"/>
+          <w:b/>
+          <w:i w:val="0"/>
+          <w:color w:val="000000"/>
+          <w:sz w:val="38"/>
         </w:rPr>
-        <w:t xml:space="preserve">{{ nachricht.DATUMZEIT }} – {{ nachricht.SENDER }}</w:t>
-      </w:r>
-      <w:r>
-        <w:rPr>
-          <w:rFonts w:ascii="Carlito" w:hAnsi="Carlito" w:eastAsia="Carlito" w:cs="Carlito"/>
-          <w:u w:val="single"/>
-        </w:rPr>
-      </w:r>
-      <w:r>
-        <w:rPr>
-          <w:rFonts w:ascii="Carlito" w:hAnsi="Carlito" w:cs="Carlito"/>
-          <w:u w:val="single"/>
-        </w:rPr>
+        <w:t>Nachforderungen</w:t>
       </w:r>
     </w:p>
     <w:p>
       <w:pPr>
-        <w:pBdr/>
-        <w:spacing/>
-        <w:ind/>
-        <w:rPr>
-          <w:rFonts w:ascii="Carlito" w:hAnsi="Carlito" w:cs="Carlito"/>
-        </w:rPr>
+        <w:keepNext w:val="0"/>
+        <w:spacing w:before="0" w:after="0" w:line="252" w:lineRule="auto"/>
       </w:pPr>
       <w:r>
         <w:rPr>
-          <w:rFonts w:ascii="Carlito" w:hAnsi="Carlito" w:eastAsia="Carlito" w:cs="Carlito"/>
+          <w:rFonts w:ascii="Carlito" w:hAnsi="Carlito"/>
+          <w:b w:val="0"/>
+          <w:i w:val="0"/>
+          <w:color w:val="7F7F7F"/>
+          <w:sz w:val="16"/>
         </w:rPr>
-        <w:t xml:space="preserve">{{ nachricht.NACHRICHT }}</w:t>
-      </w:r>
-      <w:r>
-        <w:rPr>
-          <w:rFonts w:ascii="Carlito" w:hAnsi="Carlito" w:eastAsia="Carlito" w:cs="Carlito"/>
-        </w:rPr>
-      </w:r>
-      <w:r>
-        <w:rPr>
-          <w:rFonts w:ascii="Carlito" w:hAnsi="Carlito" w:cs="Carlito"/>
-        </w:rPr>
+        <w:t>{%p if NACHFORDERUNGEN %}</w:t>
       </w:r>
     </w:p>
     <w:p>
       <w:pPr>
-        <w:pBdr/>
-        <w:spacing/>
-        <w:ind/>
-        <w:rPr>
-          <w:rFonts w:ascii="Carlito" w:hAnsi="Carlito" w:cs="Carlito"/>
-        </w:rPr>
+        <w:keepNext w:val="0"/>
+        <w:spacing w:before="0" w:after="0" w:line="252" w:lineRule="auto"/>
       </w:pPr>
       <w:r>
         <w:rPr>
-          <w:rFonts w:ascii="Carlito" w:hAnsi="Carlito" w:eastAsia="Carlito" w:cs="Carlito"/>
+          <w:rFonts w:ascii="Carlito" w:hAnsi="Carlito"/>
+          <w:b w:val="0"/>
+          <w:i w:val="0"/>
+          <w:color w:val="7F7F7F"/>
+          <w:sz w:val="16"/>
         </w:rPr>
-      </w:r>
-      <w:r>
-        <w:rPr>
-          <w:rFonts w:ascii="Carlito" w:hAnsi="Carlito" w:eastAsia="Carlito" w:cs="Carlito"/>
-        </w:rPr>
-      </w:r>
-      <w:r>
-        <w:rPr>
-          <w:rFonts w:ascii="Carlito" w:hAnsi="Carlito" w:cs="Carlito"/>
-        </w:rPr>
+        <w:t>{%p for nachforderung in NACHFORDERUNGEN %}</w:t>
       </w:r>
     </w:p>
     <w:p>
       <w:pPr>
-        <w:pBdr/>
-        <w:spacing/>
-        <w:ind/>
-        <w:rPr>
-          <w:rFonts w:ascii="Carlito" w:hAnsi="Carlito" w:cs="Carlito"/>
-        </w:rPr>
+        <w:keepNext/>
+        <w:spacing w:before="100" w:after="40" w:line="252" w:lineRule="auto"/>
       </w:pPr>
       <w:r>
         <w:rPr>
-          <w:rFonts w:ascii="Carlito" w:hAnsi="Carlito" w:eastAsia="Carlito" w:cs="Carlito"/>
+          <w:rFonts w:ascii="Carlito" w:hAnsi="Carlito"/>
+          <w:b/>
+          <w:i w:val="0"/>
+          <w:color w:val="000000"/>
+          <w:sz w:val="24"/>
         </w:rPr>
-        <w:t xml:space="preserve">{% endfor %}</w:t>
+        <w:t>Nachforderung {{ loop.index }}</w:t>
       </w:r>
+    </w:p>
+    <w:tbl>
+      <w:tblPr>
+        <w:tblW w:type="auto" w:w="0"/>
+        <w:tblLayout w:type="fixed"/>
+        <w:tblLook w:firstColumn="1" w:firstRow="1" w:lastColumn="0" w:lastRow="0" w:noHBand="0" w:noVBand="1" w:val="04A0"/>
+        <w:tblBorders>
+          <w:top w:val="single" w:sz="8" w:space="0" w:color="000000"/>
+          <w:left w:val="single" w:sz="8" w:space="0" w:color="000000"/>
+          <w:bottom w:val="single" w:sz="8" w:space="0" w:color="000000"/>
+          <w:right w:val="single" w:sz="8" w:space="0" w:color="000000"/>
+          <w:insideH w:val="single" w:sz="8" w:space="0" w:color="000000"/>
+          <w:insideV w:val="single" w:sz="8" w:space="0" w:color="000000"/>
+        </w:tblBorders>
+      </w:tblPr>
+      <w:tblGrid>
+        <w:gridCol w:w="1928"/>
+        <w:gridCol w:w="1928"/>
+        <w:gridCol w:w="1928"/>
+        <w:gridCol w:w="1928"/>
+        <w:gridCol w:w="1928"/>
+      </w:tblGrid>
+      <w:tr>
+        <w:trPr>
+          <w:tblHeader w:val="true"/>
+        </w:trPr>
+        <w:tc>
+          <w:tcPr>
+            <w:tcW w:type="dxa" w:w="1531"/>
+            <w:vAlign w:val="center"/>
+            <w:tcMar>
+              <w:top w:w="85" w:type="dxa"/>
+              <w:start w:w="57" w:type="dxa"/>
+              <w:bottom w:w="85" w:type="dxa"/>
+              <w:end w:w="85" w:type="dxa"/>
+            </w:tcMar>
+          </w:tcPr>
+          <w:p>
+            <w:pPr>
+              <w:keepNext w:val="0"/>
+              <w:spacing w:before="0" w:after="0" w:line="252" w:lineRule="auto"/>
+              <w:jc w:val="left"/>
+            </w:pPr>
+            <w:r/>
+            <w:r>
+              <w:rPr>
+                <w:rFonts w:ascii="Carlito" w:hAnsi="Carlito"/>
+                <w:b/>
+                <w:i w:val="0"/>
+                <w:color w:val="000000"/>
+                <w:sz w:val="24"/>
+              </w:rPr>
+              <w:t>Datum</w:t>
+            </w:r>
+          </w:p>
+        </w:tc>
+        <w:tc>
+          <w:tcPr>
+            <w:tcW w:type="dxa" w:w="2098"/>
+            <w:vAlign w:val="center"/>
+            <w:tcMar>
+              <w:top w:w="85" w:type="dxa"/>
+              <w:start w:w="57" w:type="dxa"/>
+              <w:bottom w:w="85" w:type="dxa"/>
+              <w:end w:w="85" w:type="dxa"/>
+            </w:tcMar>
+          </w:tcPr>
+          <w:p>
+            <w:pPr>
+              <w:keepNext w:val="0"/>
+              <w:spacing w:before="0" w:after="0" w:line="252" w:lineRule="auto"/>
+              <w:jc w:val="left"/>
+            </w:pPr>
+            <w:r/>
+            <w:r>
+              <w:rPr>
+                <w:rFonts w:ascii="Carlito" w:hAnsi="Carlito"/>
+                <w:b/>
+                <w:i w:val="0"/>
+                <w:color w:val="000000"/>
+                <w:sz w:val="24"/>
+              </w:rPr>
+              <w:t>Absender / Organisation</w:t>
+            </w:r>
+          </w:p>
+        </w:tc>
+        <w:tc>
+          <w:tcPr>
+            <w:tcW w:type="dxa" w:w="3061"/>
+            <w:vAlign w:val="center"/>
+            <w:tcMar>
+              <w:top w:w="85" w:type="dxa"/>
+              <w:start w:w="57" w:type="dxa"/>
+              <w:bottom w:w="85" w:type="dxa"/>
+              <w:end w:w="85" w:type="dxa"/>
+            </w:tcMar>
+          </w:tcPr>
+          <w:p>
+            <w:pPr>
+              <w:keepNext w:val="0"/>
+              <w:spacing w:before="0" w:after="0" w:line="252" w:lineRule="auto"/>
+              <w:jc w:val="left"/>
+            </w:pPr>
+            <w:r/>
+            <w:r>
+              <w:rPr>
+                <w:rFonts w:ascii="Carlito" w:hAnsi="Carlito"/>
+                <w:b/>
+                <w:i w:val="0"/>
+                <w:color w:val="000000"/>
+                <w:sz w:val="24"/>
+              </w:rPr>
+              <w:t>Nachricht</w:t>
+            </w:r>
+          </w:p>
+        </w:tc>
+        <w:tc>
+          <w:tcPr>
+            <w:tcW w:type="dxa" w:w="1077"/>
+            <w:vAlign w:val="center"/>
+            <w:tcMar>
+              <w:top w:w="85" w:type="dxa"/>
+              <w:start w:w="57" w:type="dxa"/>
+              <w:bottom w:w="85" w:type="dxa"/>
+              <w:end w:w="85" w:type="dxa"/>
+            </w:tcMar>
+          </w:tcPr>
+          <w:p>
+            <w:pPr>
+              <w:keepNext w:val="0"/>
+              <w:spacing w:before="0" w:after="0" w:line="252" w:lineRule="auto"/>
+              <w:jc w:val="left"/>
+            </w:pPr>
+            <w:r/>
+            <w:r>
+              <w:rPr>
+                <w:rFonts w:ascii="Carlito" w:hAnsi="Carlito"/>
+                <w:b/>
+                <w:i w:val="0"/>
+                <w:color w:val="000000"/>
+                <w:sz w:val="24"/>
+              </w:rPr>
+              <w:t>Frist</w:t>
+            </w:r>
+          </w:p>
+        </w:tc>
+        <w:tc>
+          <w:tcPr>
+            <w:tcW w:type="dxa" w:w="1474"/>
+            <w:vAlign w:val="center"/>
+            <w:tcMar>
+              <w:top w:w="85" w:type="dxa"/>
+              <w:start w:w="57" w:type="dxa"/>
+              <w:bottom w:w="85" w:type="dxa"/>
+              <w:end w:w="85" w:type="dxa"/>
+            </w:tcMar>
+          </w:tcPr>
+          <w:p>
+            <w:pPr>
+              <w:keepNext w:val="0"/>
+              <w:spacing w:before="0" w:after="0" w:line="252" w:lineRule="auto"/>
+              <w:jc w:val="left"/>
+            </w:pPr>
+            <w:r/>
+            <w:r>
+              <w:rPr>
+                <w:rFonts w:ascii="Carlito" w:hAnsi="Carlito"/>
+                <w:b/>
+                <w:i w:val="0"/>
+                <w:color w:val="000000"/>
+                <w:sz w:val="24"/>
+              </w:rPr>
+              <w:t>Ergebnis</w:t>
+            </w:r>
+          </w:p>
+        </w:tc>
+      </w:tr>
+      <w:tr>
+        <w:tc>
+          <w:tcPr>
+            <w:tcW w:type="dxa" w:w="1531"/>
+            <w:vAlign w:val="center"/>
+            <w:tcMar>
+              <w:top w:w="85" w:type="dxa"/>
+              <w:start w:w="57" w:type="dxa"/>
+              <w:bottom w:w="85" w:type="dxa"/>
+              <w:end w:w="85" w:type="dxa"/>
+            </w:tcMar>
+          </w:tcPr>
+          <w:p>
+            <w:pPr>
+              <w:keepNext w:val="0"/>
+              <w:spacing w:before="0" w:after="0" w:line="252" w:lineRule="auto"/>
+              <w:jc w:val="left"/>
+            </w:pPr>
+            <w:r/>
+            <w:r>
+              <w:rPr>
+                <w:rFonts w:ascii="Carlito" w:hAnsi="Carlito"/>
+                <w:b w:val="0"/>
+                <w:i w:val="0"/>
+                <w:color w:val="000000"/>
+                <w:sz w:val="24"/>
+              </w:rPr>
+              <w:t>{%tr for nachricht in nachforderung.NACHRICHTEN %}</w:t>
+            </w:r>
+          </w:p>
+        </w:tc>
+        <w:tc>
+          <w:tcPr>
+            <w:tcW w:type="dxa" w:w="2098"/>
+            <w:vAlign w:val="center"/>
+            <w:tcMar>
+              <w:top w:w="85" w:type="dxa"/>
+              <w:start w:w="57" w:type="dxa"/>
+              <w:bottom w:w="85" w:type="dxa"/>
+              <w:end w:w="85" w:type="dxa"/>
+            </w:tcMar>
+          </w:tcPr>
+          <w:p>
+            <w:pPr>
+              <w:keepNext w:val="0"/>
+              <w:spacing w:before="0" w:after="0" w:line="252" w:lineRule="auto"/>
+              <w:jc w:val="left"/>
+            </w:pPr>
+            <w:r/>
+            <w:r>
+              <w:rPr>
+                <w:rFonts w:ascii="Carlito" w:hAnsi="Carlito"/>
+                <w:b w:val="0"/>
+                <w:i w:val="0"/>
+                <w:color w:val="000000"/>
+                <w:sz w:val="24"/>
+              </w:rPr>
+            </w:r>
+          </w:p>
+        </w:tc>
+        <w:tc>
+          <w:tcPr>
+            <w:tcW w:type="dxa" w:w="3061"/>
+            <w:vAlign w:val="center"/>
+            <w:tcMar>
+              <w:top w:w="85" w:type="dxa"/>
+              <w:start w:w="57" w:type="dxa"/>
+              <w:bottom w:w="85" w:type="dxa"/>
+              <w:end w:w="85" w:type="dxa"/>
+            </w:tcMar>
+          </w:tcPr>
+          <w:p>
+            <w:pPr>
+              <w:keepNext w:val="0"/>
+              <w:spacing w:before="0" w:after="0" w:line="252" w:lineRule="auto"/>
+              <w:jc w:val="left"/>
+            </w:pPr>
+            <w:r/>
+            <w:r>
+              <w:rPr>
+                <w:rFonts w:ascii="Carlito" w:hAnsi="Carlito"/>
+                <w:b w:val="0"/>
+                <w:i w:val="0"/>
+                <w:color w:val="000000"/>
+                <w:sz w:val="24"/>
+              </w:rPr>
+            </w:r>
+          </w:p>
+        </w:tc>
+        <w:tc>
+          <w:tcPr>
+            <w:tcW w:type="dxa" w:w="1077"/>
+            <w:vAlign w:val="center"/>
+            <w:tcMar>
+              <w:top w:w="85" w:type="dxa"/>
+              <w:start w:w="57" w:type="dxa"/>
+              <w:bottom w:w="85" w:type="dxa"/>
+              <w:end w:w="85" w:type="dxa"/>
+            </w:tcMar>
+          </w:tcPr>
+          <w:p>
+            <w:pPr>
+              <w:keepNext w:val="0"/>
+              <w:spacing w:before="0" w:after="0" w:line="252" w:lineRule="auto"/>
+              <w:jc w:val="left"/>
+            </w:pPr>
+            <w:r/>
+            <w:r>
+              <w:rPr>
+                <w:rFonts w:ascii="Carlito" w:hAnsi="Carlito"/>
+                <w:b w:val="0"/>
+                <w:i w:val="0"/>
+                <w:color w:val="000000"/>
+                <w:sz w:val="24"/>
+              </w:rPr>
+            </w:r>
+          </w:p>
+        </w:tc>
+        <w:tc>
+          <w:tcPr>
+            <w:tcW w:type="dxa" w:w="1474"/>
+            <w:vAlign w:val="center"/>
+            <w:tcMar>
+              <w:top w:w="85" w:type="dxa"/>
+              <w:start w:w="57" w:type="dxa"/>
+              <w:bottom w:w="85" w:type="dxa"/>
+              <w:end w:w="85" w:type="dxa"/>
+            </w:tcMar>
+          </w:tcPr>
+          <w:p>
+            <w:pPr>
+              <w:keepNext w:val="0"/>
+              <w:spacing w:before="0" w:after="0" w:line="252" w:lineRule="auto"/>
+              <w:jc w:val="left"/>
+            </w:pPr>
+            <w:r/>
+            <w:r>
+              <w:rPr>
+                <w:rFonts w:ascii="Carlito" w:hAnsi="Carlito"/>
+                <w:b w:val="0"/>
+                <w:i w:val="0"/>
+                <w:color w:val="000000"/>
+                <w:sz w:val="24"/>
+              </w:rPr>
+            </w:r>
+          </w:p>
+        </w:tc>
+      </w:tr>
+      <w:tr>
+        <w:trPr>
+          <w:cantSplit w:val="true"/>
+        </w:trPr>
+        <w:tc>
+          <w:tcPr>
+            <w:tcW w:type="dxa" w:w="1531"/>
+            <w:vAlign w:val="center"/>
+            <w:tcMar>
+              <w:top w:w="85" w:type="dxa"/>
+              <w:start w:w="57" w:type="dxa"/>
+              <w:bottom w:w="85" w:type="dxa"/>
+              <w:end w:w="85" w:type="dxa"/>
+            </w:tcMar>
+          </w:tcPr>
+          <w:p>
+            <w:pPr>
+              <w:keepNext w:val="0"/>
+              <w:spacing w:before="0" w:after="0" w:line="252" w:lineRule="auto"/>
+              <w:jc w:val="left"/>
+            </w:pPr>
+            <w:r/>
+            <w:r>
+              <w:rPr>
+                <w:rFonts w:ascii="Carlito" w:hAnsi="Carlito"/>
+                <w:b w:val="0"/>
+                <w:i w:val="0"/>
+                <w:color w:val="000000"/>
+                <w:sz w:val="24"/>
+              </w:rPr>
+              <w:t>{{ nachricht.DATUMZEIT }}</w:t>
+            </w:r>
+          </w:p>
+        </w:tc>
+        <w:tc>
+          <w:tcPr>
+            <w:tcW w:type="dxa" w:w="2098"/>
+            <w:vAlign w:val="center"/>
+            <w:tcMar>
+              <w:top w:w="85" w:type="dxa"/>
+              <w:start w:w="57" w:type="dxa"/>
+              <w:bottom w:w="85" w:type="dxa"/>
+              <w:end w:w="85" w:type="dxa"/>
+            </w:tcMar>
+          </w:tcPr>
+          <w:p>
+            <w:pPr>
+              <w:keepNext w:val="0"/>
+              <w:spacing w:before="0" w:after="0" w:line="252" w:lineRule="auto"/>
+              <w:jc w:val="left"/>
+            </w:pPr>
+            <w:r/>
+            <w:r>
+              <w:rPr>
+                <w:rFonts w:ascii="Carlito" w:hAnsi="Carlito"/>
+                <w:b w:val="0"/>
+                <w:i w:val="0"/>
+                <w:color w:val="000000"/>
+                <w:sz w:val="24"/>
+              </w:rPr>
+              <w:t>{{ nachricht.SENDER }}</w:t>
+              <w:br/>
+              <w:t>{{ nachricht.ORGANISATION }}</w:t>
+            </w:r>
+          </w:p>
+        </w:tc>
+        <w:tc>
+          <w:tcPr>
+            <w:tcW w:type="dxa" w:w="3061"/>
+            <w:vAlign w:val="center"/>
+            <w:tcMar>
+              <w:top w:w="85" w:type="dxa"/>
+              <w:start w:w="57" w:type="dxa"/>
+              <w:bottom w:w="85" w:type="dxa"/>
+              <w:end w:w="85" w:type="dxa"/>
+            </w:tcMar>
+          </w:tcPr>
+          <w:p>
+            <w:pPr>
+              <w:keepNext w:val="0"/>
+              <w:spacing w:before="0" w:after="0" w:line="252" w:lineRule="auto"/>
+              <w:jc w:val="left"/>
+            </w:pPr>
+            <w:r/>
+            <w:r>
+              <w:rPr>
+                <w:rFonts w:ascii="Carlito" w:hAnsi="Carlito"/>
+                <w:b w:val="0"/>
+                <w:i w:val="0"/>
+                <w:color w:val="000000"/>
+                <w:sz w:val="24"/>
+              </w:rPr>
+              <w:t>{{ nachricht.NACHRICHT }}</w:t>
+            </w:r>
+          </w:p>
+        </w:tc>
+        <w:tc>
+          <w:tcPr>
+            <w:tcW w:type="dxa" w:w="1077"/>
+            <w:vAlign w:val="center"/>
+            <w:tcMar>
+              <w:top w:w="85" w:type="dxa"/>
+              <w:start w:w="57" w:type="dxa"/>
+              <w:bottom w:w="85" w:type="dxa"/>
+              <w:end w:w="85" w:type="dxa"/>
+            </w:tcMar>
+          </w:tcPr>
+          <w:p>
+            <w:pPr>
+              <w:keepNext w:val="0"/>
+              <w:spacing w:before="0" w:after="0" w:line="252" w:lineRule="auto"/>
+              <w:jc w:val="left"/>
+            </w:pPr>
+            <w:r/>
+            <w:r>
+              <w:rPr>
+                <w:rFonts w:ascii="Carlito" w:hAnsi="Carlito"/>
+                <w:b w:val="0"/>
+                <w:i w:val="0"/>
+                <w:color w:val="000000"/>
+                <w:sz w:val="24"/>
+              </w:rPr>
+              <w:t>{{ nachricht.FRIST }}</w:t>
+            </w:r>
+          </w:p>
+        </w:tc>
+        <w:tc>
+          <w:tcPr>
+            <w:tcW w:type="dxa" w:w="1474"/>
+            <w:vAlign w:val="center"/>
+            <w:tcMar>
+              <w:top w:w="85" w:type="dxa"/>
+              <w:start w:w="57" w:type="dxa"/>
+              <w:bottom w:w="85" w:type="dxa"/>
+              <w:end w:w="85" w:type="dxa"/>
+            </w:tcMar>
+          </w:tcPr>
+          <w:p>
+            <w:pPr>
+              <w:keepNext w:val="0"/>
+              <w:spacing w:before="0" w:after="0" w:line="252" w:lineRule="auto"/>
+              <w:jc w:val="left"/>
+            </w:pPr>
+            <w:r/>
+            <w:r>
+              <w:rPr>
+                <w:rFonts w:ascii="Carlito" w:hAnsi="Carlito"/>
+                <w:b w:val="0"/>
+                <w:i w:val="0"/>
+                <w:color w:val="000000"/>
+                <w:sz w:val="24"/>
+              </w:rPr>
+              <w:t>{{ nachricht.ERGEBNIS }}</w:t>
+            </w:r>
+          </w:p>
+        </w:tc>
+      </w:tr>
+      <w:tr>
+        <w:tc>
+          <w:tcPr>
+            <w:tcW w:type="dxa" w:w="1531"/>
+            <w:vAlign w:val="center"/>
+            <w:tcMar>
+              <w:top w:w="85" w:type="dxa"/>
+              <w:start w:w="57" w:type="dxa"/>
+              <w:bottom w:w="85" w:type="dxa"/>
+              <w:end w:w="85" w:type="dxa"/>
+            </w:tcMar>
+          </w:tcPr>
+          <w:p>
+            <w:pPr>
+              <w:keepNext w:val="0"/>
+              <w:spacing w:before="0" w:after="0" w:line="252" w:lineRule="auto"/>
+              <w:jc w:val="left"/>
+            </w:pPr>
+            <w:r/>
+            <w:r>
+              <w:rPr>
+                <w:rFonts w:ascii="Carlito" w:hAnsi="Carlito"/>
+                <w:b w:val="0"/>
+                <w:i w:val="0"/>
+                <w:color w:val="000000"/>
+                <w:sz w:val="24"/>
+              </w:rPr>
+              <w:t>{%tr endfor %}</w:t>
+            </w:r>
+          </w:p>
+        </w:tc>
+        <w:tc>
+          <w:tcPr>
+            <w:tcW w:type="dxa" w:w="2098"/>
+            <w:vAlign w:val="center"/>
+            <w:tcMar>
+              <w:top w:w="85" w:type="dxa"/>
+              <w:start w:w="57" w:type="dxa"/>
+              <w:bottom w:w="85" w:type="dxa"/>
+              <w:end w:w="85" w:type="dxa"/>
+            </w:tcMar>
+          </w:tcPr>
+          <w:p>
+            <w:pPr>
+              <w:keepNext w:val="0"/>
+              <w:spacing w:before="0" w:after="0" w:line="252" w:lineRule="auto"/>
+              <w:jc w:val="left"/>
+            </w:pPr>
+            <w:r/>
+            <w:r>
+              <w:rPr>
+                <w:rFonts w:ascii="Carlito" w:hAnsi="Carlito"/>
+                <w:b w:val="0"/>
+                <w:i w:val="0"/>
+                <w:color w:val="000000"/>
+                <w:sz w:val="24"/>
+              </w:rPr>
+            </w:r>
+          </w:p>
+        </w:tc>
+        <w:tc>
+          <w:tcPr>
+            <w:tcW w:type="dxa" w:w="3061"/>
+            <w:vAlign w:val="center"/>
+            <w:tcMar>
+              <w:top w:w="85" w:type="dxa"/>
+              <w:start w:w="57" w:type="dxa"/>
+              <w:bottom w:w="85" w:type="dxa"/>
+              <w:end w:w="85" w:type="dxa"/>
+            </w:tcMar>
+          </w:tcPr>
+          <w:p>
+            <w:pPr>
+              <w:keepNext w:val="0"/>
+              <w:spacing w:before="0" w:after="0" w:line="252" w:lineRule="auto"/>
+              <w:jc w:val="left"/>
+            </w:pPr>
+            <w:r/>
+            <w:r>
+              <w:rPr>
+                <w:rFonts w:ascii="Carlito" w:hAnsi="Carlito"/>
+                <w:b w:val="0"/>
+                <w:i w:val="0"/>
+                <w:color w:val="000000"/>
+                <w:sz w:val="24"/>
+              </w:rPr>
+            </w:r>
+          </w:p>
+        </w:tc>
+        <w:tc>
+          <w:tcPr>
+            <w:tcW w:type="dxa" w:w="1077"/>
+            <w:vAlign w:val="center"/>
+            <w:tcMar>
+              <w:top w:w="85" w:type="dxa"/>
+              <w:start w:w="57" w:type="dxa"/>
+              <w:bottom w:w="85" w:type="dxa"/>
+              <w:end w:w="85" w:type="dxa"/>
+            </w:tcMar>
+          </w:tcPr>
+          <w:p>
+            <w:pPr>
+              <w:keepNext w:val="0"/>
+              <w:spacing w:before="0" w:after="0" w:line="252" w:lineRule="auto"/>
+              <w:jc w:val="left"/>
+            </w:pPr>
+            <w:r/>
+            <w:r>
+              <w:rPr>
+                <w:rFonts w:ascii="Carlito" w:hAnsi="Carlito"/>
+                <w:b w:val="0"/>
+                <w:i w:val="0"/>
+                <w:color w:val="000000"/>
+                <w:sz w:val="24"/>
+              </w:rPr>
+            </w:r>
+          </w:p>
+        </w:tc>
+        <w:tc>
+          <w:tcPr>
+            <w:tcW w:type="dxa" w:w="1474"/>
+            <w:vAlign w:val="center"/>
+            <w:tcMar>
+              <w:top w:w="85" w:type="dxa"/>
+              <w:start w:w="57" w:type="dxa"/>
+              <w:bottom w:w="85" w:type="dxa"/>
+              <w:end w:w="85" w:type="dxa"/>
+            </w:tcMar>
+          </w:tcPr>
+          <w:p>
+            <w:pPr>
+              <w:keepNext w:val="0"/>
+              <w:spacing w:before="0" w:after="0" w:line="252" w:lineRule="auto"/>
+              <w:jc w:val="left"/>
+            </w:pPr>
+            <w:r/>
+            <w:r>
+              <w:rPr>
+                <w:rFonts w:ascii="Carlito" w:hAnsi="Carlito"/>
+                <w:b w:val="0"/>
+                <w:i w:val="0"/>
+                <w:color w:val="000000"/>
+                <w:sz w:val="24"/>
+              </w:rPr>
+            </w:r>
+          </w:p>
+        </w:tc>
+      </w:tr>
+    </w:tbl>
+    <w:p>
+      <w:pPr>
+        <w:keepNext w:val="0"/>
+        <w:spacing w:before="0" w:after="40" w:line="252" w:lineRule="auto"/>
+      </w:pPr>
+    </w:p>
+    <w:p>
+      <w:pPr>
+        <w:keepNext w:val="0"/>
+        <w:spacing w:before="0" w:after="0" w:line="252" w:lineRule="auto"/>
+      </w:pPr>
       <w:r>
         <w:rPr>
-          <w:rFonts w:ascii="Carlito" w:hAnsi="Carlito" w:eastAsia="Carlito" w:cs="Carlito"/>
+          <w:rFonts w:ascii="Carlito" w:hAnsi="Carlito"/>
+          <w:b w:val="0"/>
+          <w:i w:val="0"/>
+          <w:color w:val="7F7F7F"/>
+          <w:sz w:val="16"/>
         </w:rPr>
-      </w:r>
-      <w:r>
-        <w:rPr>
-          <w:rFonts w:ascii="Carlito" w:hAnsi="Carlito" w:cs="Carlito"/>
-        </w:rPr>
+        <w:t>{%p endfor %}</w:t>
       </w:r>
     </w:p>
     <w:p>
       <w:pPr>
-        <w:pBdr/>
-        <w:spacing/>
-        <w:ind/>
-        <w:rPr>
-          <w:rFonts w:ascii="Carlito" w:hAnsi="Carlito" w:cs="Carlito"/>
-        </w:rPr>
+        <w:keepNext w:val="0"/>
+        <w:spacing w:before="0" w:after="0" w:line="252" w:lineRule="auto"/>
       </w:pPr>
       <w:r>
         <w:rPr>
-          <w:rFonts w:ascii="Carlito" w:hAnsi="Carlito" w:eastAsia="Carlito" w:cs="Carlito"/>
+          <w:rFonts w:ascii="Carlito" w:hAnsi="Carlito"/>
+          <w:b w:val="0"/>
+          <w:i w:val="0"/>
+          <w:color w:val="7F7F7F"/>
+          <w:sz w:val="16"/>
         </w:rPr>
-        <w:t xml:space="preserve">{% endfor %}</w:t>
-      </w:r>
-      <w:r>
-        <w:rPr>
-          <w:rFonts w:ascii="Carlito" w:hAnsi="Carlito" w:eastAsia="Carlito" w:cs="Carlito"/>
-        </w:rPr>
-      </w:r>
-      <w:r>
-        <w:rPr>
-          <w:rFonts w:ascii="Carlito" w:hAnsi="Carlito" w:cs="Carlito"/>
-        </w:rPr>
+        <w:t>{%p else %}</w:t>
       </w:r>
     </w:p>
     <w:p>
       <w:pPr>
-        <w:pBdr/>
-        <w:spacing/>
-        <w:ind/>
-        <w:rPr>
-          <w:rFonts w:ascii="Carlito" w:hAnsi="Carlito" w:cs="Carlito"/>
-        </w:rPr>
+        <w:keepNext w:val="0"/>
+        <w:spacing w:before="0" w:after="60" w:line="252" w:lineRule="auto"/>
       </w:pPr>
       <w:r>
         <w:rPr>
-          <w:rFonts w:ascii="Carlito" w:hAnsi="Carlito" w:eastAsia="Carlito" w:cs="Carlito"/>
+          <w:rFonts w:ascii="Carlito" w:hAnsi="Carlito"/>
+          <w:b w:val="0"/>
+          <w:i/>
+          <w:color w:val="000000"/>
+          <w:sz w:val="24"/>
         </w:rPr>
-      </w:r>
-      <w:r>
-        <w:rPr>
-          <w:rFonts w:ascii="Carlito" w:hAnsi="Carlito" w:eastAsia="Carlito" w:cs="Carlito"/>
-        </w:rPr>
-      </w:r>
-      <w:r>
-        <w:rPr>
-          <w:rFonts w:ascii="Carlito" w:hAnsi="Carlito" w:cs="Carlito"/>
-        </w:rPr>
+        <w:t>Keine Daten vorhanden.</w:t>
       </w:r>
     </w:p>
     <w:p>
       <w:pPr>
-        <w:pBdr/>
-        <w:shd w:val="nil" w:color="000000"/>
-        <w:spacing/>
-        <w:ind/>
-        <w:rPr>
-          <w:rFonts w:ascii="Carlito" w:hAnsi="Carlito" w:cs="Carlito"/>
-        </w:rPr>
+        <w:keepNext w:val="0"/>
+        <w:spacing w:before="0" w:after="0" w:line="252" w:lineRule="auto"/>
       </w:pPr>
       <w:r>
         <w:rPr>
-          <w:rFonts w:ascii="Carlito" w:hAnsi="Carlito" w:cs="Carlito"/>
+          <w:rFonts w:ascii="Carlito" w:hAnsi="Carlito"/>
+          <w:b w:val="0"/>
+          <w:i w:val="0"/>
+          <w:color w:val="7F7F7F"/>
+          <w:sz w:val="16"/>
         </w:rPr>
-      </w:r>
-      <w:r>
-        <w:rPr>
-          <w:rFonts w:ascii="Carlito" w:hAnsi="Carlito" w:cs="Carlito"/>
-        </w:rPr>
-      </w:r>
-      <w:r>
-        <w:rPr>
-          <w:rFonts w:ascii="Carlito" w:hAnsi="Carlito" w:cs="Carlito"/>
-        </w:rPr>
+        <w:t>{%p endif %}</w:t>
       </w:r>
     </w:p>
     <w:p>
       <w:pPr>
-        <w:pStyle w:val="945"/>
-        <w:pBdr/>
-        <w:spacing/>
-        <w:ind/>
-        <w:jc w:val="left"/>
-        <w:rPr>
-          <w:rFonts w:ascii="Carlito" w:hAnsi="Carlito" w:eastAsia="Carlito" w:cs="Carlito"/>
-          <w:b/>
-          <w:bCs/>
-          <w:sz w:val="38"/>
-          <w:szCs w:val="38"/>
-          <w:highlight w:val="none"/>
-          <w:lang w:val="en-US"/>
-        </w:rPr>
+        <w:keepNext/>
+        <w:spacing w:before="320" w:after="140" w:line="252" w:lineRule="auto"/>
       </w:pPr>
       <w:r>
         <w:rPr>
-          <w:rFonts w:ascii="Carlito" w:hAnsi="Carlito" w:eastAsia="Carlito" w:cs="Carlito"/>
+          <w:rFonts w:ascii="Carlito" w:hAnsi="Carlito"/>
           <w:b/>
-          <w:bCs/>
+          <w:i w:val="0"/>
+          <w:color w:val="000000"/>
           <w:sz w:val="38"/>
-          <w:szCs w:val="38"/>
-          <w:lang w:val="en-US"/>
         </w:rPr>
-        <w:t xml:space="preserve">Journal</w:t>
-      </w:r>
-      <w:r>
-        <w:rPr>
-          <w:rFonts w:ascii="Carlito" w:hAnsi="Carlito" w:eastAsia="Carlito" w:cs="Carlito"/>
-        </w:rPr>
-      </w:r>
-      <w:r>
-        <w:rPr>
-          <w:rFonts w:ascii="Carlito" w:hAnsi="Carlito" w:eastAsia="Carlito" w:cs="Carlito"/>
-          <w:b/>
-          <w:bCs/>
-          <w:sz w:val="38"/>
-          <w:szCs w:val="38"/>
-          <w:highlight w:val="none"/>
-          <w:lang w:val="en-US"/>
-        </w:rPr>
+        <w:t>Journal</w:t>
       </w:r>
     </w:p>
     <w:p>
       <w:pPr>
-        <w:pBdr/>
-        <w:spacing/>
-        <w:ind/>
-        <w:rPr>
-          <w:rFonts w:ascii="Carlito" w:hAnsi="Carlito" w:cs="Carlito"/>
-        </w:rPr>
+        <w:keepNext w:val="0"/>
+        <w:spacing w:before="0" w:after="0" w:line="252" w:lineRule="auto"/>
       </w:pPr>
       <w:r>
         <w:rPr>
-          <w:rFonts w:ascii="Carlito" w:hAnsi="Carlito" w:eastAsia="Carlito" w:cs="Carlito"/>
+          <w:rFonts w:ascii="Carlito" w:hAnsi="Carlito"/>
+          <w:b w:val="0"/>
+          <w:i w:val="0"/>
+          <w:color w:val="7F7F7F"/>
+          <w:sz w:val="16"/>
         </w:rPr>
+        <w:t>{%p if NOTIZEN %}</w:t>
       </w:r>
+    </w:p>
+    <w:tbl>
+      <w:tblPr>
+        <w:tblW w:type="auto" w:w="0"/>
+        <w:tblLayout w:type="fixed"/>
+        <w:tblLook w:firstColumn="1" w:firstRow="1" w:lastColumn="0" w:lastRow="0" w:noHBand="0" w:noVBand="1" w:val="04A0"/>
+        <w:tblBorders>
+          <w:top w:val="single" w:sz="8" w:space="0" w:color="000000"/>
+          <w:left w:val="single" w:sz="8" w:space="0" w:color="000000"/>
+          <w:bottom w:val="single" w:sz="8" w:space="0" w:color="000000"/>
+          <w:right w:val="single" w:sz="8" w:space="0" w:color="000000"/>
+          <w:insideH w:val="single" w:sz="8" w:space="0" w:color="000000"/>
+          <w:insideV w:val="single" w:sz="8" w:space="0" w:color="000000"/>
+        </w:tblBorders>
+      </w:tblPr>
+      <w:tblGrid>
+        <w:gridCol w:w="3213"/>
+        <w:gridCol w:w="3213"/>
+        <w:gridCol w:w="3213"/>
+      </w:tblGrid>
+      <w:tr>
+        <w:trPr>
+          <w:tblHeader w:val="true"/>
+        </w:trPr>
+        <w:tc>
+          <w:tcPr>
+            <w:tcW w:type="dxa" w:w="2041"/>
+            <w:vAlign w:val="center"/>
+            <w:tcMar>
+              <w:top w:w="85" w:type="dxa"/>
+              <w:start w:w="57" w:type="dxa"/>
+              <w:bottom w:w="85" w:type="dxa"/>
+              <w:end w:w="85" w:type="dxa"/>
+            </w:tcMar>
+          </w:tcPr>
+          <w:p>
+            <w:pPr>
+              <w:keepNext w:val="0"/>
+              <w:spacing w:before="0" w:after="0" w:line="252" w:lineRule="auto"/>
+              <w:jc w:val="left"/>
+            </w:pPr>
+            <w:r/>
+            <w:r>
+              <w:rPr>
+                <w:rFonts w:ascii="Carlito" w:hAnsi="Carlito"/>
+                <w:b/>
+                <w:i w:val="0"/>
+                <w:color w:val="000000"/>
+                <w:sz w:val="24"/>
+              </w:rPr>
+              <w:t>Autor</w:t>
+            </w:r>
+          </w:p>
+        </w:tc>
+        <w:tc>
+          <w:tcPr>
+            <w:tcW w:type="dxa" w:w="2381"/>
+            <w:vAlign w:val="center"/>
+            <w:tcMar>
+              <w:top w:w="85" w:type="dxa"/>
+              <w:start w:w="57" w:type="dxa"/>
+              <w:bottom w:w="85" w:type="dxa"/>
+              <w:end w:w="85" w:type="dxa"/>
+            </w:tcMar>
+          </w:tcPr>
+          <w:p>
+            <w:pPr>
+              <w:keepNext w:val="0"/>
+              <w:spacing w:before="0" w:after="0" w:line="252" w:lineRule="auto"/>
+              <w:jc w:val="left"/>
+            </w:pPr>
+            <w:r/>
+            <w:r>
+              <w:rPr>
+                <w:rFonts w:ascii="Carlito" w:hAnsi="Carlito"/>
+                <w:b/>
+                <w:i w:val="0"/>
+                <w:color w:val="000000"/>
+                <w:sz w:val="24"/>
+              </w:rPr>
+              <w:t>Organisation</w:t>
+            </w:r>
+          </w:p>
+        </w:tc>
+        <w:tc>
+          <w:tcPr>
+            <w:tcW w:type="dxa" w:w="4819"/>
+            <w:vAlign w:val="center"/>
+            <w:tcMar>
+              <w:top w:w="85" w:type="dxa"/>
+              <w:start w:w="57" w:type="dxa"/>
+              <w:bottom w:w="85" w:type="dxa"/>
+              <w:end w:w="85" w:type="dxa"/>
+            </w:tcMar>
+          </w:tcPr>
+          <w:p>
+            <w:pPr>
+              <w:keepNext w:val="0"/>
+              <w:spacing w:before="0" w:after="0" w:line="252" w:lineRule="auto"/>
+              <w:jc w:val="left"/>
+            </w:pPr>
+            <w:r/>
+            <w:r>
+              <w:rPr>
+                <w:rFonts w:ascii="Carlito" w:hAnsi="Carlito"/>
+                <w:b/>
+                <w:i w:val="0"/>
+                <w:color w:val="000000"/>
+                <w:sz w:val="24"/>
+              </w:rPr>
+              <w:t>Eintrag</w:t>
+            </w:r>
+          </w:p>
+        </w:tc>
+      </w:tr>
+      <w:tr>
+        <w:tc>
+          <w:tcPr>
+            <w:tcW w:type="dxa" w:w="2041"/>
+            <w:vAlign w:val="center"/>
+            <w:tcMar>
+              <w:top w:w="85" w:type="dxa"/>
+              <w:start w:w="57" w:type="dxa"/>
+              <w:bottom w:w="85" w:type="dxa"/>
+              <w:end w:w="85" w:type="dxa"/>
+            </w:tcMar>
+          </w:tcPr>
+          <w:p>
+            <w:pPr>
+              <w:keepNext w:val="0"/>
+              <w:spacing w:before="0" w:after="0" w:line="252" w:lineRule="auto"/>
+              <w:jc w:val="left"/>
+            </w:pPr>
+            <w:r/>
+            <w:r>
+              <w:rPr>
+                <w:rFonts w:ascii="Carlito" w:hAnsi="Carlito"/>
+                <w:b w:val="0"/>
+                <w:i w:val="0"/>
+                <w:color w:val="000000"/>
+                <w:sz w:val="24"/>
+              </w:rPr>
+              <w:t>{%tr for notiz in NOTIZEN %}</w:t>
+            </w:r>
+          </w:p>
+        </w:tc>
+        <w:tc>
+          <w:tcPr>
+            <w:tcW w:type="dxa" w:w="2381"/>
+            <w:vAlign w:val="center"/>
+            <w:tcMar>
+              <w:top w:w="85" w:type="dxa"/>
+              <w:start w:w="57" w:type="dxa"/>
+              <w:bottom w:w="85" w:type="dxa"/>
+              <w:end w:w="85" w:type="dxa"/>
+            </w:tcMar>
+          </w:tcPr>
+          <w:p>
+            <w:pPr>
+              <w:keepNext w:val="0"/>
+              <w:spacing w:before="0" w:after="0" w:line="252" w:lineRule="auto"/>
+              <w:jc w:val="left"/>
+            </w:pPr>
+            <w:r/>
+            <w:r>
+              <w:rPr>
+                <w:rFonts w:ascii="Carlito" w:hAnsi="Carlito"/>
+                <w:b w:val="0"/>
+                <w:i w:val="0"/>
+                <w:color w:val="000000"/>
+                <w:sz w:val="24"/>
+              </w:rPr>
+            </w:r>
+          </w:p>
+        </w:tc>
+        <w:tc>
+          <w:tcPr>
+            <w:tcW w:type="dxa" w:w="4819"/>
+            <w:vAlign w:val="center"/>
+            <w:tcMar>
+              <w:top w:w="85" w:type="dxa"/>
+              <w:start w:w="57" w:type="dxa"/>
+              <w:bottom w:w="85" w:type="dxa"/>
+              <w:end w:w="85" w:type="dxa"/>
+            </w:tcMar>
+          </w:tcPr>
+          <w:p>
+            <w:pPr>
+              <w:keepNext w:val="0"/>
+              <w:spacing w:before="0" w:after="0" w:line="252" w:lineRule="auto"/>
+              <w:jc w:val="left"/>
+            </w:pPr>
+            <w:r/>
+            <w:r>
+              <w:rPr>
+                <w:rFonts w:ascii="Carlito" w:hAnsi="Carlito"/>
+                <w:b w:val="0"/>
+                <w:i w:val="0"/>
+                <w:color w:val="000000"/>
+                <w:sz w:val="24"/>
+              </w:rPr>
+            </w:r>
+          </w:p>
+        </w:tc>
+      </w:tr>
+      <w:tr>
+        <w:trPr>
+          <w:cantSplit w:val="true"/>
+        </w:trPr>
+        <w:tc>
+          <w:tcPr>
+            <w:tcW w:type="dxa" w:w="2041"/>
+            <w:vAlign w:val="center"/>
+            <w:tcMar>
+              <w:top w:w="85" w:type="dxa"/>
+              <w:start w:w="57" w:type="dxa"/>
+              <w:bottom w:w="85" w:type="dxa"/>
+              <w:end w:w="85" w:type="dxa"/>
+            </w:tcMar>
+          </w:tcPr>
+          <w:p>
+            <w:pPr>
+              <w:keepNext w:val="0"/>
+              <w:spacing w:before="0" w:after="0" w:line="252" w:lineRule="auto"/>
+              <w:jc w:val="left"/>
+            </w:pPr>
+            <w:r/>
+            <w:r>
+              <w:rPr>
+                <w:rFonts w:ascii="Carlito" w:hAnsi="Carlito"/>
+                <w:b w:val="0"/>
+                <w:i w:val="0"/>
+                <w:color w:val="000000"/>
+                <w:sz w:val="24"/>
+              </w:rPr>
+              <w:t>{{ notiz.AUTHOR }}</w:t>
+            </w:r>
+          </w:p>
+        </w:tc>
+        <w:tc>
+          <w:tcPr>
+            <w:tcW w:type="dxa" w:w="2381"/>
+            <w:vAlign w:val="center"/>
+            <w:tcMar>
+              <w:top w:w="85" w:type="dxa"/>
+              <w:start w:w="57" w:type="dxa"/>
+              <w:bottom w:w="85" w:type="dxa"/>
+              <w:end w:w="85" w:type="dxa"/>
+            </w:tcMar>
+          </w:tcPr>
+          <w:p>
+            <w:pPr>
+              <w:keepNext w:val="0"/>
+              <w:spacing w:before="0" w:after="0" w:line="252" w:lineRule="auto"/>
+              <w:jc w:val="left"/>
+            </w:pPr>
+            <w:r/>
+            <w:r>
+              <w:rPr>
+                <w:rFonts w:ascii="Carlito" w:hAnsi="Carlito"/>
+                <w:b w:val="0"/>
+                <w:i w:val="0"/>
+                <w:color w:val="000000"/>
+                <w:sz w:val="24"/>
+              </w:rPr>
+              <w:t>{{ notiz.ORGANISATION }}</w:t>
+            </w:r>
+          </w:p>
+        </w:tc>
+        <w:tc>
+          <w:tcPr>
+            <w:tcW w:type="dxa" w:w="4819"/>
+            <w:vAlign w:val="center"/>
+            <w:tcMar>
+              <w:top w:w="85" w:type="dxa"/>
+              <w:start w:w="57" w:type="dxa"/>
+              <w:bottom w:w="85" w:type="dxa"/>
+              <w:end w:w="85" w:type="dxa"/>
+            </w:tcMar>
+          </w:tcPr>
+          <w:p>
+            <w:pPr>
+              <w:keepNext w:val="0"/>
+              <w:spacing w:before="0" w:after="0" w:line="252" w:lineRule="auto"/>
+              <w:jc w:val="left"/>
+            </w:pPr>
+            <w:r/>
+            <w:r>
+              <w:rPr>
+                <w:rFonts w:ascii="Carlito" w:hAnsi="Carlito"/>
+                <w:b w:val="0"/>
+                <w:i w:val="0"/>
+                <w:color w:val="000000"/>
+                <w:sz w:val="24"/>
+              </w:rPr>
+              <w:t>{{ notiz.TEXT }}</w:t>
+            </w:r>
+          </w:p>
+        </w:tc>
+      </w:tr>
+      <w:tr>
+        <w:tc>
+          <w:tcPr>
+            <w:tcW w:type="dxa" w:w="2041"/>
+            <w:vAlign w:val="center"/>
+            <w:tcMar>
+              <w:top w:w="85" w:type="dxa"/>
+              <w:start w:w="57" w:type="dxa"/>
+              <w:bottom w:w="85" w:type="dxa"/>
+              <w:end w:w="85" w:type="dxa"/>
+            </w:tcMar>
+          </w:tcPr>
+          <w:p>
+            <w:pPr>
+              <w:keepNext w:val="0"/>
+              <w:spacing w:before="0" w:after="0" w:line="252" w:lineRule="auto"/>
+              <w:jc w:val="left"/>
+            </w:pPr>
+            <w:r/>
+            <w:r>
+              <w:rPr>
+                <w:rFonts w:ascii="Carlito" w:hAnsi="Carlito"/>
+                <w:b w:val="0"/>
+                <w:i w:val="0"/>
+                <w:color w:val="000000"/>
+                <w:sz w:val="24"/>
+              </w:rPr>
+              <w:t>{%tr endfor %}</w:t>
+            </w:r>
+          </w:p>
+        </w:tc>
+        <w:tc>
+          <w:tcPr>
+            <w:tcW w:type="dxa" w:w="2381"/>
+            <w:vAlign w:val="center"/>
+            <w:tcMar>
+              <w:top w:w="85" w:type="dxa"/>
+              <w:start w:w="57" w:type="dxa"/>
+              <w:bottom w:w="85" w:type="dxa"/>
+              <w:end w:w="85" w:type="dxa"/>
+            </w:tcMar>
+          </w:tcPr>
+          <w:p>
+            <w:pPr>
+              <w:keepNext w:val="0"/>
+              <w:spacing w:before="0" w:after="0" w:line="252" w:lineRule="auto"/>
+              <w:jc w:val="left"/>
+            </w:pPr>
+            <w:r/>
+            <w:r>
+              <w:rPr>
+                <w:rFonts w:ascii="Carlito" w:hAnsi="Carlito"/>
+                <w:b w:val="0"/>
+                <w:i w:val="0"/>
+                <w:color w:val="000000"/>
+                <w:sz w:val="24"/>
+              </w:rPr>
+            </w:r>
+          </w:p>
+        </w:tc>
+        <w:tc>
+          <w:tcPr>
+            <w:tcW w:type="dxa" w:w="4819"/>
+            <w:vAlign w:val="center"/>
+            <w:tcMar>
+              <w:top w:w="85" w:type="dxa"/>
+              <w:start w:w="57" w:type="dxa"/>
+              <w:bottom w:w="85" w:type="dxa"/>
+              <w:end w:w="85" w:type="dxa"/>
+            </w:tcMar>
+          </w:tcPr>
+          <w:p>
+            <w:pPr>
+              <w:keepNext w:val="0"/>
+              <w:spacing w:before="0" w:after="0" w:line="252" w:lineRule="auto"/>
+              <w:jc w:val="left"/>
+            </w:pPr>
+            <w:r/>
+            <w:r>
+              <w:rPr>
+                <w:rFonts w:ascii="Carlito" w:hAnsi="Carlito"/>
+                <w:b w:val="0"/>
+                <w:i w:val="0"/>
+                <w:color w:val="000000"/>
+                <w:sz w:val="24"/>
+              </w:rPr>
+            </w:r>
+          </w:p>
+        </w:tc>
+      </w:tr>
+    </w:tbl>
+    <w:p>
+      <w:pPr>
+        <w:keepNext w:val="0"/>
+        <w:spacing w:before="0" w:after="40" w:line="252" w:lineRule="auto"/>
+      </w:pPr>
+    </w:p>
+    <w:p>
+      <w:pPr>
+        <w:keepNext w:val="0"/>
+        <w:spacing w:before="0" w:after="0" w:line="252" w:lineRule="auto"/>
+      </w:pPr>
       <w:r>
         <w:rPr>
-          <w:rFonts w:ascii="Carlito" w:hAnsi="Carlito" w:eastAsia="Carlito" w:cs="Carlito"/>
+          <w:rFonts w:ascii="Carlito" w:hAnsi="Carlito"/>
+          <w:b w:val="0"/>
+          <w:i w:val="0"/>
+          <w:color w:val="7F7F7F"/>
+          <w:sz w:val="16"/>
         </w:rPr>
-      </w:r>
-      <w:r>
-        <w:rPr>
-          <w:rFonts w:ascii="Carlito" w:hAnsi="Carlito" w:cs="Carlito"/>
-        </w:rPr>
+        <w:t>{%p else %}</w:t>
       </w:r>
     </w:p>
     <w:p>
       <w:pPr>
-        <w:pBdr/>
-        <w:spacing/>
-        <w:ind/>
-        <w:rPr>
-          <w:rFonts w:ascii="Carlito" w:hAnsi="Carlito" w:cs="Carlito"/>
-        </w:rPr>
+        <w:keepNext w:val="0"/>
+        <w:spacing w:before="0" w:after="60" w:line="252" w:lineRule="auto"/>
       </w:pPr>
       <w:r>
         <w:rPr>
-          <w:rFonts w:ascii="Carlito" w:hAnsi="Carlito" w:eastAsia="Carlito" w:cs="Carlito"/>
+          <w:rFonts w:ascii="Carlito" w:hAnsi="Carlito"/>
+          <w:b w:val="0"/>
+          <w:i/>
+          <w:color w:val="000000"/>
+          <w:sz w:val="24"/>
         </w:rPr>
-        <w:t xml:space="preserve">{% for notiz in NOTIZEN %}</w:t>
-      </w:r>
-      <w:r>
-        <w:rPr>
-          <w:rFonts w:ascii="Carlito" w:hAnsi="Carlito" w:eastAsia="Carlito" w:cs="Carlito"/>
-        </w:rPr>
-      </w:r>
-      <w:r>
-        <w:rPr>
-          <w:rFonts w:ascii="Carlito" w:hAnsi="Carlito" w:cs="Carlito"/>
-        </w:rPr>
+        <w:t>Keine Daten vorhanden.</w:t>
       </w:r>
     </w:p>
     <w:p>
       <w:pPr>
-        <w:pBdr/>
-        <w:spacing/>
-        <w:ind/>
-        <w:rPr>
-          <w:rFonts w:ascii="Carlito" w:hAnsi="Carlito" w:cs="Carlito"/>
-          <w:b/>
-          <w:bCs/>
-        </w:rPr>
+        <w:keepNext w:val="0"/>
+        <w:spacing w:before="0" w:after="0" w:line="252" w:lineRule="auto"/>
       </w:pPr>
       <w:r>
         <w:rPr>
-          <w:rFonts w:ascii="Carlito" w:hAnsi="Carlito" w:eastAsia="Carlito" w:cs="Carlito"/>
-          <w:b/>
-          <w:bCs/>
+          <w:rFonts w:ascii="Carlito" w:hAnsi="Carlito"/>
+          <w:b w:val="0"/>
+          <w:i w:val="0"/>
+          <w:color w:val="7F7F7F"/>
+          <w:sz w:val="16"/>
         </w:rPr>
-        <w:t xml:space="preserve">{{ notiz.AUTHOR }} – {{ notiz.ORGANISATION }}</w:t>
+        <w:t>{%p endif %}</w:t>
       </w:r>
-      <w:r>
-        <w:rPr>
-          <w:rFonts w:ascii="Carlito" w:hAnsi="Carlito" w:eastAsia="Carlito" w:cs="Carlito"/>
-          <w:b/>
-          <w:bCs/>
-        </w:rPr>
-      </w:r>
-      <w:r>
-        <w:rPr>
-          <w:rFonts w:ascii="Carlito" w:hAnsi="Carlito" w:cs="Carlito"/>
-          <w:b/>
-          <w:bCs/>
-        </w:rPr>
-      </w:r>
-    </w:p>
-    <w:p>
-      <w:pPr>
-        <w:pBdr/>
-        <w:spacing/>
-        <w:ind/>
-        <w:rPr>
-          <w:rFonts w:ascii="Carlito" w:hAnsi="Carlito" w:cs="Carlito"/>
-          <w:highlight w:val="none"/>
-        </w:rPr>
-      </w:pPr>
-      <w:r>
-        <w:rPr>
-          <w:rFonts w:ascii="Carlito" w:hAnsi="Carlito" w:eastAsia="Carlito" w:cs="Carlito"/>
-        </w:rPr>
-        <w:t xml:space="preserve">{{ notiz.TEXT }}</w:t>
-      </w:r>
-      <w:r>
-        <w:rPr>
-          <w:rFonts w:ascii="Carlito" w:hAnsi="Carlito" w:eastAsia="Carlito" w:cs="Carlito"/>
-          <w:highlight w:val="none"/>
-        </w:rPr>
-      </w:r>
-      <w:r>
-        <w:rPr>
-          <w:rFonts w:ascii="Carlito" w:hAnsi="Carlito" w:cs="Carlito"/>
-          <w:highlight w:val="none"/>
-        </w:rPr>
-      </w:r>
-    </w:p>
-    <w:p>
-      <w:pPr>
-        <w:pBdr/>
-        <w:spacing/>
-        <w:ind/>
-        <w:rPr>
-          <w:rFonts w:ascii="Carlito" w:hAnsi="Carlito" w:cs="Carlito"/>
-        </w:rPr>
-      </w:pPr>
-      <w:r>
-        <w:rPr>
-          <w:rFonts w:ascii="Carlito" w:hAnsi="Carlito" w:eastAsia="Carlito" w:cs="Carlito"/>
-          <w:highlight w:val="none"/>
-        </w:rPr>
-      </w:r>
-      <w:r>
-        <w:rPr>
-          <w:rFonts w:ascii="Carlito" w:hAnsi="Carlito" w:eastAsia="Carlito" w:cs="Carlito"/>
-        </w:rPr>
-      </w:r>
-      <w:r>
-        <w:rPr>
-          <w:rFonts w:ascii="Carlito" w:hAnsi="Carlito" w:cs="Carlito"/>
-        </w:rPr>
-      </w:r>
-    </w:p>
-    <w:p>
-      <w:pPr>
-        <w:pBdr/>
-        <w:spacing/>
-        <w:ind/>
-        <w:rPr>
-          <w:rFonts w:ascii="Carlito" w:hAnsi="Carlito" w:cs="Carlito"/>
-          <w:highlight w:val="none"/>
-        </w:rPr>
-      </w:pPr>
-      <w:r>
-        <w:rPr>
-          <w:rFonts w:ascii="Carlito" w:hAnsi="Carlito" w:eastAsia="Carlito" w:cs="Carlito"/>
-        </w:rPr>
-        <w:t xml:space="preserve">{% endfor %}</w:t>
-      </w:r>
-      <w:r>
-        <w:rPr>
-          <w:rFonts w:ascii="Carlito" w:hAnsi="Carlito" w:eastAsia="Carlito" w:cs="Carlito"/>
-          <w:highlight w:val="none"/>
-        </w:rPr>
-      </w:r>
-      <w:r>
-        <w:rPr>
-          <w:rFonts w:ascii="Carlito" w:hAnsi="Carlito" w:cs="Carlito"/>
-          <w:highlight w:val="none"/>
-        </w:rPr>
-      </w:r>
-    </w:p>
-    <w:p>
-      <w:pPr>
-        <w:pBdr/>
-        <w:spacing/>
-        <w:ind/>
-        <w:rPr/>
-      </w:pPr>
-      <w:r>
-        <w:rPr>
-          <w:highlight w:val="none"/>
-        </w:rPr>
-      </w:r>
-      <w:r>
-        <w:rPr>
-          <w:highlight w:val="none"/>
-        </w:rPr>
-      </w:r>
-      <w:r/>
     </w:p>
     <w:sectPr>
       <w:footerReference w:type="default" r:id="rId9"/>

</xml_diff>